<commit_message>
Update automation prototype and findings report
</commit_message>
<xml_diff>
--- a/Reports/Sample499/FindingsReportTest.docx
+++ b/Reports/Sample499/FindingsReportTest.docx
@@ -19,7 +19,7 @@
         <mc:AlternateContent>
           <mc:Choice Requires="wps">
             <w:drawing>
-              <wp:anchor distT="0" distB="0" distL="114300" distR="114300" simplePos="0" relativeHeight="251663360" behindDoc="1" locked="0" layoutInCell="1" allowOverlap="1" wp14:anchorId="19184A86" wp14:editId="53EFB6D1">
+              <wp:anchor distT="0" distB="0" distL="114300" distR="114300" simplePos="0" relativeHeight="251663360" behindDoc="1" locked="0" layoutInCell="1" allowOverlap="1" wp14:anchorId="07BFD3E2" wp14:editId="65302E4F">
                 <wp:simplePos x="0" y="0"/>
                 <wp:positionH relativeFrom="margin">
                   <wp:posOffset>-1010031</wp:posOffset>
@@ -79,7 +79,7 @@
           </mc:Choice>
           <mc:Fallback>
             <w:pict>
-              <v:rect w14:anchorId="19184A86" id="Rectangle 355773799" o:spid="_x0000_s1026" style="position:absolute;left:0;text-align:left;margin-left:-79.55pt;margin-top:0;width:617.25pt;height:791.25pt;z-index:-251653120;visibility:visible;mso-wrap-style:square;mso-width-percent:0;mso-height-percent:0;mso-wrap-distance-left:9pt;mso-wrap-distance-top:0;mso-wrap-distance-right:9pt;mso-wrap-distance-bottom:0;mso-position-horizontal:absolute;mso-position-horizontal-relative:margin;mso-position-vertical:top;mso-position-vertical-relative:page;mso-width-percent:0;mso-height-percent:0;mso-width-relative:margin;mso-height-relative:margin;v-text-anchor:middle" o:gfxdata="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" fillcolor="#3e332e" stroked="f" strokeweight="1pt">
+              <v:rect w14:anchorId="07BFD3E2" id="Rectangle 355773799" o:spid="_x0000_s1026" style="position:absolute;left:0;text-align:left;margin-left:-79.55pt;margin-top:0;width:617.25pt;height:791.25pt;z-index:-251653120;visibility:visible;mso-wrap-style:square;mso-width-percent:0;mso-height-percent:0;mso-wrap-distance-left:9pt;mso-wrap-distance-top:0;mso-wrap-distance-right:9pt;mso-wrap-distance-bottom:0;mso-position-horizontal:absolute;mso-position-horizontal-relative:margin;mso-position-vertical:top;mso-position-vertical-relative:page;mso-width-percent:0;mso-height-percent:0;mso-width-relative:margin;mso-height-relative:margin;v-text-anchor:middle" o:gfxdata="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" fillcolor="#3e332e" stroked="f" strokeweight="1pt">
                 <v:textbox>
                   <w:txbxContent>
                     <w:p/>
@@ -113,7 +113,7 @@
           <w14:ligatures w14:val="none"/>
         </w:rPr>
         <w:drawing>
-          <wp:anchor distT="0" distB="0" distL="114300" distR="114300" simplePos="0" relativeHeight="251661312" behindDoc="0" locked="0" layoutInCell="1" allowOverlap="1" wp14:anchorId="2E455C59" wp14:editId="35F495CE">
+          <wp:anchor distT="0" distB="0" distL="114300" distR="114300" simplePos="0" relativeHeight="251661312" behindDoc="0" locked="0" layoutInCell="1" allowOverlap="1" wp14:anchorId="046D8929" wp14:editId="7933920E">
             <wp:simplePos x="0" y="0"/>
             <wp:positionH relativeFrom="margin">
               <wp:posOffset>1861820</wp:posOffset>
@@ -187,7 +187,7 @@
         <mc:AlternateContent>
           <mc:Choice Requires="wps">
             <w:drawing>
-              <wp:anchor distT="0" distB="0" distL="114300" distR="114300" simplePos="0" relativeHeight="251659264" behindDoc="1" locked="0" layoutInCell="1" allowOverlap="1" wp14:anchorId="0323C0A7" wp14:editId="0DA27EB8">
+              <wp:anchor distT="0" distB="0" distL="114300" distR="114300" simplePos="0" relativeHeight="251659264" behindDoc="1" locked="0" layoutInCell="1" allowOverlap="1" wp14:anchorId="4A770AB6" wp14:editId="53E2CA0C">
                 <wp:simplePos x="0" y="0"/>
                 <wp:positionH relativeFrom="margin">
                   <wp:align>center</wp:align>
@@ -251,7 +251,7 @@
           </mc:Choice>
           <mc:Fallback>
             <w:pict>
-              <v:rect w14:anchorId="0323C0A7" id="Rectangle 1" o:spid="_x0000_s1027" style="position:absolute;margin-left:0;margin-top:-.05pt;width:617.25pt;height:791.25pt;z-index:-251657216;visibility:visible;mso-wrap-style:square;mso-width-percent:0;mso-height-percent:0;mso-wrap-distance-left:9pt;mso-wrap-distance-top:0;mso-wrap-distance-right:9pt;mso-wrap-distance-bottom:0;mso-position-horizontal:center;mso-position-horizontal-relative:margin;mso-position-vertical:absolute;mso-position-vertical-relative:page;mso-width-percent:0;mso-height-percent:0;mso-width-relative:margin;mso-height-relative:margin;v-text-anchor:middle" o:gfxdata="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" fillcolor="#3e332e" stroked="f" strokeweight="1pt">
+              <v:rect w14:anchorId="4A770AB6" id="Rectangle 1" o:spid="_x0000_s1027" style="position:absolute;margin-left:0;margin-top:-.05pt;width:617.25pt;height:791.25pt;z-index:-251657216;visibility:visible;mso-wrap-style:square;mso-width-percent:0;mso-height-percent:0;mso-wrap-distance-left:9pt;mso-wrap-distance-top:0;mso-wrap-distance-right:9pt;mso-wrap-distance-bottom:0;mso-position-horizontal:center;mso-position-horizontal-relative:margin;mso-position-vertical:absolute;mso-position-vertical-relative:page;mso-width-percent:0;mso-height-percent:0;mso-width-relative:margin;mso-height-relative:margin;v-text-anchor:middle" o:gfxdata="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" fillcolor="#3e332e" stroked="f" strokeweight="1pt">
                 <v:textbox>
                   <w:txbxContent>
                     <w:p>
@@ -601,7 +601,7 @@
           <w14:ligatures w14:val="none"/>
         </w:rPr>
         <w:drawing>
-          <wp:anchor distT="0" distB="0" distL="114300" distR="114300" simplePos="0" relativeHeight="251662336" behindDoc="0" locked="0" layoutInCell="1" allowOverlap="1" wp14:anchorId="2DE4073A" wp14:editId="7D4E2166">
+          <wp:anchor distT="0" distB="0" distL="114300" distR="114300" simplePos="0" relativeHeight="251662336" behindDoc="0" locked="0" layoutInCell="1" allowOverlap="1" wp14:anchorId="3E6E17B5" wp14:editId="2A2DE2AF">
             <wp:simplePos x="0" y="0"/>
             <wp:positionH relativeFrom="margin">
               <wp:posOffset>1163955</wp:posOffset>
@@ -669,7 +669,7 @@
         <mc:AlternateContent>
           <mc:Choice Requires="wps">
             <w:drawing>
-              <wp:anchor distT="45720" distB="45720" distL="114300" distR="114300" simplePos="0" relativeHeight="251660288" behindDoc="0" locked="0" layoutInCell="1" allowOverlap="1" wp14:anchorId="3EE71AFD" wp14:editId="430337D9">
+              <wp:anchor distT="45720" distB="45720" distL="114300" distR="114300" simplePos="0" relativeHeight="251660288" behindDoc="0" locked="0" layoutInCell="1" allowOverlap="1" wp14:anchorId="5E434348" wp14:editId="55791691">
                 <wp:simplePos x="0" y="0"/>
                 <wp:positionH relativeFrom="page">
                   <wp:posOffset>2536825</wp:posOffset>
@@ -823,7 +823,7 @@
           </mc:Choice>
           <mc:Fallback>
             <w:pict>
-              <v:shapetype w14:anchorId="3EE71AFD" id="_x0000_t202" coordsize="21600,21600" o:spt="202" path="m,l,21600r21600,l21600,xe">
+              <v:shapetype w14:anchorId="5E434348" id="_x0000_t202" coordsize="21600,21600" o:spt="202" path="m,l,21600r21600,l21600,xe">
                 <v:stroke joinstyle="miter"/>
                 <v:path gradientshapeok="t" o:connecttype="rect"/>
               </v:shapetype>
@@ -4375,7 +4375,7 @@
           <w14:ligatures w14:val="none"/>
         </w:rPr>
         <w:drawing>
-          <wp:inline distT="0" distB="0" distL="0" distR="0" wp14:anchorId="6D8254CC" wp14:editId="3BFC1590">
+          <wp:inline distT="0" distB="0" distL="0" distR="0" wp14:anchorId="2163AAB8" wp14:editId="079919DB">
             <wp:extent cx="5486400" cy="2743200"/>
             <wp:effectExtent l="0" t="0" r="0" b="0"/>
             <wp:docPr id="13" name="Chart 13"/>
@@ -4438,7 +4438,7 @@
           <w14:ligatures w14:val="none"/>
         </w:rPr>
         <w:drawing>
-          <wp:inline distT="0" distB="0" distL="0" distR="0" wp14:anchorId="50D40E1A" wp14:editId="722DDEA6">
+          <wp:inline distT="0" distB="0" distL="0" distR="0" wp14:anchorId="1781A534" wp14:editId="63AB69AC">
             <wp:extent cx="5486400" cy="3200400"/>
             <wp:effectExtent l="0" t="0" r="0" b="0"/>
             <wp:docPr id="1278438351" name="Chart 4"/>
@@ -4939,7 +4939,7 @@
           <w14:ligatures w14:val="none"/>
         </w:rPr>
         <w:drawing>
-          <wp:inline distT="0" distB="0" distL="0" distR="0" wp14:anchorId="64C37306" wp14:editId="39209C99">
+          <wp:inline distT="0" distB="0" distL="0" distR="0" wp14:anchorId="4201C4A6" wp14:editId="58E1F3FD">
             <wp:extent cx="5650861" cy="1682504"/>
             <wp:effectExtent l="0" t="0" r="7620" b="0"/>
             <wp:docPr id="292149150" name="Picture 1"/>
@@ -5020,7 +5020,7 @@
           <w14:ligatures w14:val="none"/>
         </w:rPr>
         <w:drawing>
-          <wp:inline distT="0" distB="0" distL="0" distR="0" wp14:anchorId="3324773E" wp14:editId="18FF6150">
+          <wp:inline distT="0" distB="0" distL="0" distR="0" wp14:anchorId="6F5A0906" wp14:editId="6C191C65">
             <wp:extent cx="5631126" cy="2463539"/>
             <wp:effectExtent l="0" t="0" r="8255" b="0"/>
             <wp:docPr id="1553660219" name="Picture 4"/>
@@ -5617,10 +5617,14 @@
     <w:p>
       <w:pPr>
         <w:pStyle w:val="ActivityBullet"/>
-      </w:pPr>
-      <w:r>
-        <w:rPr>
-          <w:sz w:val="24"/>
+        <w:rPr>
+          <w:lang w:val="fr-FR"/>
+        </w:rPr>
+      </w:pPr>
+      <w:r>
+        <w:rPr>
+          <w:sz w:val="17"/>
+          <w:lang w:val="fr-FR"/>
         </w:rPr>
         <w:t>2026-01-29 13:52:47-0500PM ET exposurescout Initiating ExposureScout module.</w:t>
       </w:r>
@@ -5631,18 +5635,36 @@
       </w:pPr>
       <w:r>
         <w:rPr>
-          <w:sz w:val="24"/>
-        </w:rPr>
-        <w:t>2026-01-29 13:52:59-0500PM ET exposurescout Enumerating subdomains from one (1) domain.</w:t>
+          <w:sz w:val="17"/>
+        </w:rPr>
+        <w:t xml:space="preserve">2026-01-29 13:52:59-0500PM ET </w:t>
+      </w:r>
+      <w:proofErr w:type="spellStart"/>
+      <w:r>
+        <w:rPr>
+          <w:sz w:val="17"/>
+        </w:rPr>
+        <w:t>exposurescout</w:t>
+      </w:r>
+      <w:proofErr w:type="spellEnd"/>
+      <w:r>
+        <w:rPr>
+          <w:sz w:val="17"/>
+        </w:rPr>
+        <w:t xml:space="preserve"> Enumerating subdomains from one (1) domain.</w:t>
       </w:r>
     </w:p>
     <w:p>
       <w:pPr>
         <w:pStyle w:val="ActivityBullet"/>
-      </w:pPr>
-      <w:r>
-        <w:rPr>
-          <w:sz w:val="24"/>
+        <w:rPr>
+          <w:lang w:val="fr-FR"/>
+        </w:rPr>
+      </w:pPr>
+      <w:r>
+        <w:rPr>
+          <w:sz w:val="17"/>
+          <w:lang w:val="fr-FR"/>
         </w:rPr>
         <w:t>2026-01-29 13:54:13-0500PM ET exposurescout Completed subdomain enumeration.</w:t>
       </w:r>
@@ -5653,18 +5675,36 @@
       </w:pPr>
       <w:r>
         <w:rPr>
-          <w:sz w:val="24"/>
-        </w:rPr>
-        <w:t>2026-01-29 13:54:13-0500PM ET exposurescout Beginning DNS enumeration.</w:t>
+          <w:sz w:val="17"/>
+        </w:rPr>
+        <w:t xml:space="preserve">2026-01-29 13:54:13-0500PM ET </w:t>
+      </w:r>
+      <w:proofErr w:type="spellStart"/>
+      <w:r>
+        <w:rPr>
+          <w:sz w:val="17"/>
+        </w:rPr>
+        <w:t>exposurescout</w:t>
+      </w:r>
+      <w:proofErr w:type="spellEnd"/>
+      <w:r>
+        <w:rPr>
+          <w:sz w:val="17"/>
+        </w:rPr>
+        <w:t xml:space="preserve"> Beginning DNS enumeration.</w:t>
       </w:r>
     </w:p>
     <w:p>
       <w:pPr>
         <w:pStyle w:val="ActivityBullet"/>
-      </w:pPr>
-      <w:r>
-        <w:rPr>
-          <w:sz w:val="24"/>
+        <w:rPr>
+          <w:lang w:val="fr-FR"/>
+        </w:rPr>
+      </w:pPr>
+      <w:r>
+        <w:rPr>
+          <w:sz w:val="17"/>
+          <w:lang w:val="fr-FR"/>
         </w:rPr>
         <w:t>2026-01-29 13:55:18-0500PM ET exposurescout Completed DNS enumeration.</w:t>
       </w:r>
@@ -5675,31 +5715,85 @@
       </w:pPr>
       <w:r>
         <w:rPr>
-          <w:sz w:val="24"/>
-        </w:rPr>
-        <w:t>2026-01-29 13:55:18-0500PM ET exposurescout Enumerating doppelganger domains for one (1) domain.</w:t>
+          <w:sz w:val="17"/>
+        </w:rPr>
+        <w:t xml:space="preserve">2026-01-29 13:55:18-0500PM ET </w:t>
+      </w:r>
+      <w:proofErr w:type="spellStart"/>
+      <w:r>
+        <w:rPr>
+          <w:sz w:val="17"/>
+        </w:rPr>
+        <w:t>exposurescout</w:t>
+      </w:r>
+      <w:proofErr w:type="spellEnd"/>
+      <w:r>
+        <w:rPr>
+          <w:sz w:val="17"/>
+        </w:rPr>
+        <w:t xml:space="preserve"> Enumerating doppelganger domains for one (1) domain.</w:t>
       </w:r>
     </w:p>
     <w:p>
       <w:pPr>
         <w:pStyle w:val="ActivityBullet"/>
-      </w:pPr>
-      <w:r>
-        <w:rPr>
-          <w:sz w:val="24"/>
-        </w:rPr>
-        <w:t>2026-01-29 13:56:28-0500PM ET exposurescout Ten (10) new doppelganger domains discovered.</w:t>
+        <w:rPr>
+          <w:lang w:val="fr-FR"/>
+        </w:rPr>
+      </w:pPr>
+      <w:r>
+        <w:rPr>
+          <w:sz w:val="17"/>
+          <w:lang w:val="fr-FR"/>
+        </w:rPr>
+        <w:t xml:space="preserve">2026-01-29 </w:t>
+      </w:r>
+      <w:proofErr w:type="gramStart"/>
+      <w:r>
+        <w:rPr>
+          <w:sz w:val="17"/>
+          <w:lang w:val="fr-FR"/>
+        </w:rPr>
+        <w:t>13:56:</w:t>
+      </w:r>
+      <w:proofErr w:type="gramEnd"/>
+      <w:r>
+        <w:rPr>
+          <w:sz w:val="17"/>
+          <w:lang w:val="fr-FR"/>
+        </w:rPr>
+        <w:t>28-0500PM ET exposurescout Ten (10) new doppelganger domains discovered.</w:t>
       </w:r>
     </w:p>
     <w:p>
       <w:pPr>
         <w:pStyle w:val="ActivityBullet"/>
-      </w:pPr>
-      <w:r>
-        <w:rPr>
-          <w:sz w:val="24"/>
-        </w:rPr>
-        <w:t>2026-01-29 13:56:28-0500PM ET exposurescout Completed doppelganger domain enumeration.</w:t>
+        <w:rPr>
+          <w:lang w:val="fr-FR"/>
+        </w:rPr>
+      </w:pPr>
+      <w:r>
+        <w:rPr>
+          <w:sz w:val="17"/>
+          <w:lang w:val="fr-FR"/>
+        </w:rPr>
+        <w:t xml:space="preserve">2026-01-29 </w:t>
+      </w:r>
+      <w:proofErr w:type="gramStart"/>
+      <w:r>
+        <w:rPr>
+          <w:sz w:val="17"/>
+          <w:lang w:val="fr-FR"/>
+        </w:rPr>
+        <w:t>13:56:</w:t>
+      </w:r>
+      <w:proofErr w:type="gramEnd"/>
+      <w:r>
+        <w:rPr>
+          <w:sz w:val="17"/>
+          <w:lang w:val="fr-FR"/>
+        </w:rPr>
+        <w:t>28-0500PM ET exposurescout Completed doppelganger domain enumeration.</w:t>
       </w:r>
     </w:p>
     <w:p>
@@ -5708,9 +5802,23 @@
       </w:pPr>
       <w:r>
         <w:rPr>
-          <w:sz w:val="24"/>
-        </w:rPr>
-        <w:t>2026-01-29 13:56:28-0500PM ET exposurescout Running WHOIS commands on eight (8) domains.</w:t>
+          <w:sz w:val="17"/>
+        </w:rPr>
+        <w:t xml:space="preserve">2026-01-29 13:56:28-0500PM ET </w:t>
+      </w:r>
+      <w:proofErr w:type="spellStart"/>
+      <w:r>
+        <w:rPr>
+          <w:sz w:val="17"/>
+        </w:rPr>
+        <w:t>exposurescout</w:t>
+      </w:r>
+      <w:proofErr w:type="spellEnd"/>
+      <w:r>
+        <w:rPr>
+          <w:sz w:val="17"/>
+        </w:rPr>
+        <w:t xml:space="preserve"> Running WHOIS commands on eight (8) domains.</w:t>
       </w:r>
     </w:p>
     <w:p>
@@ -5719,9 +5827,23 @@
       </w:pPr>
       <w:r>
         <w:rPr>
-          <w:sz w:val="24"/>
-        </w:rPr>
-        <w:t>2026-01-29 13:57:33-0500PM ET exposurescout Importing eight (8) WHOIS results into the database.</w:t>
+          <w:sz w:val="17"/>
+        </w:rPr>
+        <w:t xml:space="preserve">2026-01-29 13:57:33-0500PM ET </w:t>
+      </w:r>
+      <w:proofErr w:type="spellStart"/>
+      <w:r>
+        <w:rPr>
+          <w:sz w:val="17"/>
+        </w:rPr>
+        <w:t>exposurescout</w:t>
+      </w:r>
+      <w:proofErr w:type="spellEnd"/>
+      <w:r>
+        <w:rPr>
+          <w:sz w:val="17"/>
+        </w:rPr>
+        <w:t xml:space="preserve"> Importing eight (8) WHOIS results into the database.</w:t>
       </w:r>
     </w:p>
     <w:p>
@@ -5730,9 +5852,23 @@
       </w:pPr>
       <w:r>
         <w:rPr>
-          <w:sz w:val="24"/>
-        </w:rPr>
-        <w:t>2026-01-29 13:57:34-0500PM ET exposurescout Completed recursive WHOIS lookups</w:t>
+          <w:sz w:val="17"/>
+        </w:rPr>
+        <w:t xml:space="preserve">2026-01-29 13:57:34-0500PM ET </w:t>
+      </w:r>
+      <w:proofErr w:type="spellStart"/>
+      <w:r>
+        <w:rPr>
+          <w:sz w:val="17"/>
+        </w:rPr>
+        <w:t>exposurescout</w:t>
+      </w:r>
+      <w:proofErr w:type="spellEnd"/>
+      <w:r>
+        <w:rPr>
+          <w:sz w:val="17"/>
+        </w:rPr>
+        <w:t xml:space="preserve"> Completed recursive WHOIS lookups</w:t>
       </w:r>
     </w:p>
     <w:p>
@@ -5741,9 +5877,23 @@
       </w:pPr>
       <w:r>
         <w:rPr>
-          <w:sz w:val="24"/>
-        </w:rPr>
-        <w:t>2026-01-29 13:57:34-0500PM ET exposurescout Email scraping module started.</w:t>
+          <w:sz w:val="17"/>
+        </w:rPr>
+        <w:t xml:space="preserve">2026-01-29 13:57:34-0500PM ET </w:t>
+      </w:r>
+      <w:proofErr w:type="spellStart"/>
+      <w:r>
+        <w:rPr>
+          <w:sz w:val="17"/>
+        </w:rPr>
+        <w:t>exposurescout</w:t>
+      </w:r>
+      <w:proofErr w:type="spellEnd"/>
+      <w:r>
+        <w:rPr>
+          <w:sz w:val="17"/>
+        </w:rPr>
+        <w:t xml:space="preserve"> Email scraping module started.</w:t>
       </w:r>
     </w:p>
     <w:p>
@@ -5752,9 +5902,23 @@
       </w:pPr>
       <w:r>
         <w:rPr>
-          <w:sz w:val="24"/>
-        </w:rPr>
-        <w:t>2026-01-29 13:58:40-0500PM ET exposurescout Completed email scraping.</w:t>
+          <w:sz w:val="17"/>
+        </w:rPr>
+        <w:t xml:space="preserve">2026-01-29 13:58:40-0500PM ET </w:t>
+      </w:r>
+      <w:proofErr w:type="spellStart"/>
+      <w:r>
+        <w:rPr>
+          <w:sz w:val="17"/>
+        </w:rPr>
+        <w:t>exposurescout</w:t>
+      </w:r>
+      <w:proofErr w:type="spellEnd"/>
+      <w:r>
+        <w:rPr>
+          <w:sz w:val="17"/>
+        </w:rPr>
+        <w:t xml:space="preserve"> Completed email scraping.</w:t>
       </w:r>
     </w:p>
     <w:p>
@@ -5763,9 +5927,23 @@
       </w:pPr>
       <w:r>
         <w:rPr>
-          <w:sz w:val="24"/>
-        </w:rPr>
-        <w:t>2026-01-29 13:58:40-0500PM ET exposurescout Scanning subdomains for subdomain takeover vulnerability.</w:t>
+          <w:sz w:val="17"/>
+        </w:rPr>
+        <w:t xml:space="preserve">2026-01-29 13:58:40-0500PM ET </w:t>
+      </w:r>
+      <w:proofErr w:type="spellStart"/>
+      <w:r>
+        <w:rPr>
+          <w:sz w:val="17"/>
+        </w:rPr>
+        <w:t>exposurescout</w:t>
+      </w:r>
+      <w:proofErr w:type="spellEnd"/>
+      <w:r>
+        <w:rPr>
+          <w:sz w:val="17"/>
+        </w:rPr>
+        <w:t xml:space="preserve"> Scanning subdomains for subdomain takeover vulnerability.</w:t>
       </w:r>
     </w:p>
     <w:p>
@@ -5774,9 +5952,23 @@
       </w:pPr>
       <w:r>
         <w:rPr>
-          <w:sz w:val="24"/>
-        </w:rPr>
-        <w:t>2026-01-29 13:59:44-0500PM ET exposurescout Found 1 domain vulnerable to subdomain takeover.</w:t>
+          <w:sz w:val="17"/>
+        </w:rPr>
+        <w:t xml:space="preserve">2026-01-29 13:59:44-0500PM ET </w:t>
+      </w:r>
+      <w:proofErr w:type="spellStart"/>
+      <w:r>
+        <w:rPr>
+          <w:sz w:val="17"/>
+        </w:rPr>
+        <w:t>exposurescout</w:t>
+      </w:r>
+      <w:proofErr w:type="spellEnd"/>
+      <w:r>
+        <w:rPr>
+          <w:sz w:val="17"/>
+        </w:rPr>
+        <w:t xml:space="preserve"> Found 1 domain vulnerable to subdomain takeover.</w:t>
       </w:r>
     </w:p>
     <w:p>
@@ -5785,20 +5977,54 @@
       </w:pPr>
       <w:r>
         <w:rPr>
-          <w:sz w:val="24"/>
-        </w:rPr>
-        <w:t>2026-01-29 13:59:44-0500PM ET exposurescout Completed subdomain takeover checks.</w:t>
+          <w:sz w:val="17"/>
+        </w:rPr>
+        <w:t xml:space="preserve">2026-01-29 13:59:44-0500PM ET </w:t>
+      </w:r>
+      <w:proofErr w:type="spellStart"/>
+      <w:r>
+        <w:rPr>
+          <w:sz w:val="17"/>
+        </w:rPr>
+        <w:t>exposurescout</w:t>
+      </w:r>
+      <w:proofErr w:type="spellEnd"/>
+      <w:r>
+        <w:rPr>
+          <w:sz w:val="17"/>
+        </w:rPr>
+        <w:t xml:space="preserve"> Completed subdomain takeover checks.</w:t>
       </w:r>
     </w:p>
     <w:p>
       <w:pPr>
         <w:pStyle w:val="ActivityBullet"/>
-      </w:pPr>
-      <w:r>
-        <w:rPr>
-          <w:sz w:val="24"/>
-        </w:rPr>
-        <w:t>2026-01-29 13:59:44-0500PM ET exposurescout ExposureScout module completed.</w:t>
+        <w:rPr>
+          <w:lang w:val="fr-FR"/>
+        </w:rPr>
+      </w:pPr>
+      <w:r>
+        <w:rPr>
+          <w:sz w:val="17"/>
+          <w:lang w:val="fr-FR"/>
+        </w:rPr>
+        <w:t xml:space="preserve">2026-01-29 </w:t>
+      </w:r>
+      <w:proofErr w:type="gramStart"/>
+      <w:r>
+        <w:rPr>
+          <w:sz w:val="17"/>
+          <w:lang w:val="fr-FR"/>
+        </w:rPr>
+        <w:t>13:59:</w:t>
+      </w:r>
+      <w:proofErr w:type="gramEnd"/>
+      <w:r>
+        <w:rPr>
+          <w:sz w:val="17"/>
+          <w:lang w:val="fr-FR"/>
+        </w:rPr>
+        <w:t>44-0500PM ET exposurescout ExposureScout module completed.</w:t>
       </w:r>
     </w:p>
     <w:p>
@@ -5807,7 +6033,7 @@
       </w:pPr>
       <w:r>
         <w:rPr>
-          <w:sz w:val="24"/>
+          <w:sz w:val="17"/>
         </w:rPr>
         <w:t>2026-01-29 13:59:44-0500PM ET host discovery Performing DNS resolution for 1 DNS name.</w:t>
       </w:r>
@@ -5818,7 +6044,7 @@
       </w:pPr>
       <w:r>
         <w:rPr>
-          <w:sz w:val="24"/>
+          <w:sz w:val="17"/>
         </w:rPr>
         <w:t>2026-01-29 14:00:50-0500PM ET host discovery DNS resolution complete.</w:t>
       </w:r>
@@ -5829,7 +6055,7 @@
       </w:pPr>
       <w:r>
         <w:rPr>
-          <w:sz w:val="24"/>
+          <w:sz w:val="17"/>
         </w:rPr>
         <w:t>2026-01-29 14:00:50-0500PM ET host discovery Port scan module initialized.</w:t>
       </w:r>
@@ -5840,7 +6066,7 @@
       </w:pPr>
       <w:r>
         <w:rPr>
-          <w:sz w:val="24"/>
+          <w:sz w:val="17"/>
         </w:rPr>
         <w:t>2026-01-29 14:00:53-0500PM ET host discovery Conducting port scan against in-scope systems.</w:t>
       </w:r>
@@ -5851,9 +6077,23 @@
       </w:pPr>
       <w:r>
         <w:rPr>
-          <w:sz w:val="24"/>
-        </w:rPr>
-        <w:t>2026-01-29 14:00:57-0500PM ET host discovery Running nmap port scans.</w:t>
+          <w:sz w:val="17"/>
+        </w:rPr>
+        <w:t xml:space="preserve">2026-01-29 14:00:57-0500PM ET host discovery Running </w:t>
+      </w:r>
+      <w:proofErr w:type="spellStart"/>
+      <w:r>
+        <w:rPr>
+          <w:sz w:val="17"/>
+        </w:rPr>
+        <w:t>nmap</w:t>
+      </w:r>
+      <w:proofErr w:type="spellEnd"/>
+      <w:r>
+        <w:rPr>
+          <w:sz w:val="17"/>
+        </w:rPr>
+        <w:t xml:space="preserve"> port scans.</w:t>
       </w:r>
     </w:p>
     <w:p>
@@ -5862,9 +6102,23 @@
       </w:pPr>
       <w:r>
         <w:rPr>
-          <w:sz w:val="24"/>
-        </w:rPr>
-        <w:t>2026-01-29 14:02:01-0500PM ET host discovery Completed nmap port scans.</w:t>
+          <w:sz w:val="17"/>
+        </w:rPr>
+        <w:t xml:space="preserve">2026-01-29 14:02:01-0500PM ET host discovery Completed </w:t>
+      </w:r>
+      <w:proofErr w:type="spellStart"/>
+      <w:r>
+        <w:rPr>
+          <w:sz w:val="17"/>
+        </w:rPr>
+        <w:t>nmap</w:t>
+      </w:r>
+      <w:proofErr w:type="spellEnd"/>
+      <w:r>
+        <w:rPr>
+          <w:sz w:val="17"/>
+        </w:rPr>
+        <w:t xml:space="preserve"> port scans.</w:t>
       </w:r>
     </w:p>
     <w:p>
@@ -5873,7 +6127,7 @@
       </w:pPr>
       <w:r>
         <w:rPr>
-          <w:sz w:val="24"/>
+          <w:sz w:val="17"/>
         </w:rPr>
         <w:t>2026-01-29 14:02:01-0500PM ET host discovery Port scans completed successfully.</w:t>
       </w:r>
@@ -5884,7 +6138,7 @@
       </w:pPr>
       <w:r>
         <w:rPr>
-          <w:sz w:val="24"/>
+          <w:sz w:val="17"/>
         </w:rPr>
         <w:t>2026-01-29 14:02:02-0500PM ET host discovery Parsing results for alive systems.</w:t>
       </w:r>
@@ -5895,7 +6149,7 @@
       </w:pPr>
       <w:r>
         <w:rPr>
-          <w:sz w:val="24"/>
+          <w:sz w:val="17"/>
         </w:rPr>
         <w:t>2026-01-29 14:02:02-0500PM ET host discovery Completed parsing Nmap results. 1 new IP addresses discovered and imported into DB.</w:t>
       </w:r>
@@ -5906,9 +6160,23 @@
       </w:pPr>
       <w:r>
         <w:rPr>
-          <w:sz w:val="24"/>
-        </w:rPr>
-        <w:t>2026-01-29 14:02:02-0500PM ET host discovery Parsing nmap port scans.</w:t>
+          <w:sz w:val="17"/>
+        </w:rPr>
+        <w:t xml:space="preserve">2026-01-29 14:02:02-0500PM ET host discovery Parsing </w:t>
+      </w:r>
+      <w:proofErr w:type="spellStart"/>
+      <w:r>
+        <w:rPr>
+          <w:sz w:val="17"/>
+        </w:rPr>
+        <w:t>nmap</w:t>
+      </w:r>
+      <w:proofErr w:type="spellEnd"/>
+      <w:r>
+        <w:rPr>
+          <w:sz w:val="17"/>
+        </w:rPr>
+        <w:t xml:space="preserve"> port scans.</w:t>
       </w:r>
     </w:p>
     <w:p>
@@ -5917,9 +6185,23 @@
       </w:pPr>
       <w:r>
         <w:rPr>
-          <w:sz w:val="24"/>
-        </w:rPr>
-        <w:t>2026-01-29 14:02:02-0500PM ET host discovery Completed parsing port scans. Imported 3 new ports.</w:t>
+          <w:sz w:val="17"/>
+        </w:rPr>
+        <w:t xml:space="preserve">2026-01-29 14:02:02-0500PM ET </w:t>
+      </w:r>
+      <w:proofErr w:type="gramStart"/>
+      <w:r>
+        <w:rPr>
+          <w:sz w:val="17"/>
+        </w:rPr>
+        <w:t>host discovery</w:t>
+      </w:r>
+      <w:proofErr w:type="gramEnd"/>
+      <w:r>
+        <w:rPr>
+          <w:sz w:val="17"/>
+        </w:rPr>
+        <w:t xml:space="preserve"> Completed parsing port scans. Imported 3 new ports.</w:t>
       </w:r>
     </w:p>
     <w:p>
@@ -5928,7 +6210,7 @@
       </w:pPr>
       <w:r>
         <w:rPr>
-          <w:sz w:val="24"/>
+          <w:sz w:val="17"/>
         </w:rPr>
         <w:t>2026-01-29 14:02:02-0500PM ET host discovery Port scan module completed.</w:t>
       </w:r>
@@ -5939,9 +6221,24 @@
       </w:pPr>
       <w:r>
         <w:rPr>
-          <w:sz w:val="24"/>
-        </w:rPr>
-        <w:t>2026-01-29 14:02:03-0500PM ET host discovery Discovery module completed.</w:t>
+          <w:sz w:val="17"/>
+        </w:rPr>
+        <w:lastRenderedPageBreak/>
+        <w:t xml:space="preserve">2026-01-29 14:02:03-0500PM ET host discovery </w:t>
+      </w:r>
+      <w:proofErr w:type="spellStart"/>
+      <w:r>
+        <w:rPr>
+          <w:sz w:val="17"/>
+        </w:rPr>
+        <w:t>Discovery</w:t>
+      </w:r>
+      <w:proofErr w:type="spellEnd"/>
+      <w:r>
+        <w:rPr>
+          <w:sz w:val="17"/>
+        </w:rPr>
+        <w:t xml:space="preserve"> module completed.</w:t>
       </w:r>
     </w:p>
     <w:p>
@@ -5950,9 +6247,23 @@
       </w:pPr>
       <w:r>
         <w:rPr>
-          <w:sz w:val="24"/>
-        </w:rPr>
-        <w:t>2026-01-29 14:02:27-0500PM ET host discovery Running nmap port version scans.</w:t>
+          <w:sz w:val="17"/>
+        </w:rPr>
+        <w:t xml:space="preserve">2026-01-29 14:02:27-0500PM ET host discovery Running </w:t>
+      </w:r>
+      <w:proofErr w:type="spellStart"/>
+      <w:r>
+        <w:rPr>
+          <w:sz w:val="17"/>
+        </w:rPr>
+        <w:t>nmap</w:t>
+      </w:r>
+      <w:proofErr w:type="spellEnd"/>
+      <w:r>
+        <w:rPr>
+          <w:sz w:val="17"/>
+        </w:rPr>
+        <w:t xml:space="preserve"> port version scans.</w:t>
       </w:r>
     </w:p>
     <w:p>
@@ -5961,9 +6272,23 @@
       </w:pPr>
       <w:r>
         <w:rPr>
-          <w:sz w:val="24"/>
-        </w:rPr>
-        <w:t>2026-01-29 14:03:30-0500PM ET host discovery Completed nmap port version scans.</w:t>
+          <w:sz w:val="17"/>
+        </w:rPr>
+        <w:t xml:space="preserve">2026-01-29 14:03:30-0500PM ET host discovery Completed </w:t>
+      </w:r>
+      <w:proofErr w:type="spellStart"/>
+      <w:r>
+        <w:rPr>
+          <w:sz w:val="17"/>
+        </w:rPr>
+        <w:t>nmap</w:t>
+      </w:r>
+      <w:proofErr w:type="spellEnd"/>
+      <w:r>
+        <w:rPr>
+          <w:sz w:val="17"/>
+        </w:rPr>
+        <w:t xml:space="preserve"> port version scans.</w:t>
       </w:r>
     </w:p>
     <w:p>
@@ -5972,9 +6297,51 @@
       </w:pPr>
       <w:r>
         <w:rPr>
-          <w:sz w:val="24"/>
-        </w:rPr>
-        <w:t>2026-01-29 14:03:35-0500PM ET enumeration Enumeration module initialized.</w:t>
+          <w:sz w:val="17"/>
+        </w:rPr>
+        <w:t xml:space="preserve">2026-01-29 14:03:35-0500PM ET </w:t>
+      </w:r>
+      <w:proofErr w:type="gramStart"/>
+      <w:r>
+        <w:rPr>
+          <w:sz w:val="17"/>
+        </w:rPr>
+        <w:t>enumeration</w:t>
+      </w:r>
+      <w:proofErr w:type="gramEnd"/>
+      <w:r>
+        <w:rPr>
+          <w:sz w:val="17"/>
+        </w:rPr>
+        <w:t xml:space="preserve"> </w:t>
+      </w:r>
+      <w:proofErr w:type="spellStart"/>
+      <w:r>
+        <w:rPr>
+          <w:sz w:val="17"/>
+        </w:rPr>
+        <w:t>Enumeration</w:t>
+      </w:r>
+      <w:proofErr w:type="spellEnd"/>
+      <w:r>
+        <w:rPr>
+          <w:sz w:val="17"/>
+        </w:rPr>
+        <w:t xml:space="preserve"> </w:t>
+      </w:r>
+      <w:proofErr w:type="gramStart"/>
+      <w:r>
+        <w:rPr>
+          <w:sz w:val="17"/>
+        </w:rPr>
+        <w:t>module</w:t>
+      </w:r>
+      <w:proofErr w:type="gramEnd"/>
+      <w:r>
+        <w:rPr>
+          <w:sz w:val="17"/>
+        </w:rPr>
+        <w:t xml:space="preserve"> initialized.</w:t>
       </w:r>
     </w:p>
     <w:p>
@@ -5983,9 +6350,23 @@
       </w:pPr>
       <w:r>
         <w:rPr>
-          <w:sz w:val="24"/>
-        </w:rPr>
-        <w:t>2026-01-29 14:04:43-0500PM ET enumeration Enumerating HTTP services.</w:t>
+          <w:sz w:val="17"/>
+        </w:rPr>
+        <w:t xml:space="preserve">2026-01-29 14:04:43-0500PM ET </w:t>
+      </w:r>
+      <w:proofErr w:type="gramStart"/>
+      <w:r>
+        <w:rPr>
+          <w:sz w:val="17"/>
+        </w:rPr>
+        <w:t>enumeration</w:t>
+      </w:r>
+      <w:proofErr w:type="gramEnd"/>
+      <w:r>
+        <w:rPr>
+          <w:sz w:val="17"/>
+        </w:rPr>
+        <w:t xml:space="preserve"> Enumerating HTTP services.</w:t>
       </w:r>
     </w:p>
     <w:p>
@@ -5994,9 +6375,23 @@
       </w:pPr>
       <w:r>
         <w:rPr>
-          <w:sz w:val="24"/>
-        </w:rPr>
-        <w:t>2026-01-29 14:04:43-0500PM ET enumeration Enumerating HTTPS services.</w:t>
+          <w:sz w:val="17"/>
+        </w:rPr>
+        <w:t xml:space="preserve">2026-01-29 14:04:43-0500PM ET </w:t>
+      </w:r>
+      <w:proofErr w:type="gramStart"/>
+      <w:r>
+        <w:rPr>
+          <w:sz w:val="17"/>
+        </w:rPr>
+        <w:t>enumeration</w:t>
+      </w:r>
+      <w:proofErr w:type="gramEnd"/>
+      <w:r>
+        <w:rPr>
+          <w:sz w:val="17"/>
+        </w:rPr>
+        <w:t xml:space="preserve"> Enumerating HTTPS services.</w:t>
       </w:r>
     </w:p>
     <w:p>
@@ -6005,7 +6400,7 @@
       </w:pPr>
       <w:r>
         <w:rPr>
-          <w:sz w:val="24"/>
+          <w:sz w:val="17"/>
         </w:rPr>
         <w:t>2026-01-29 14:04:43-0500PM ET enumeration Enumerating SSH services.</w:t>
       </w:r>
@@ -6016,9 +6411,23 @@
       </w:pPr>
       <w:r>
         <w:rPr>
-          <w:sz w:val="24"/>
-        </w:rPr>
-        <w:t>2026-01-29 14:04:47-0500PM ET enumeration Running nmap script scan using script: http-headers.</w:t>
+          <w:sz w:val="17"/>
+        </w:rPr>
+        <w:t xml:space="preserve">2026-01-29 14:04:47-0500PM ET enumeration Running </w:t>
+      </w:r>
+      <w:proofErr w:type="spellStart"/>
+      <w:r>
+        <w:rPr>
+          <w:sz w:val="17"/>
+        </w:rPr>
+        <w:t>nmap</w:t>
+      </w:r>
+      <w:proofErr w:type="spellEnd"/>
+      <w:r>
+        <w:rPr>
+          <w:sz w:val="17"/>
+        </w:rPr>
+        <w:t xml:space="preserve"> script scan using script: http-headers.</w:t>
       </w:r>
     </w:p>
     <w:p>
@@ -6027,9 +6436,23 @@
       </w:pPr>
       <w:r>
         <w:rPr>
-          <w:sz w:val="24"/>
-        </w:rPr>
-        <w:t>2026-01-29 14:04:47-0500PM ET enumeration Running nmap script scan using script: http-methods.</w:t>
+          <w:sz w:val="17"/>
+        </w:rPr>
+        <w:t xml:space="preserve">2026-01-29 14:04:47-0500PM ET enumeration Running </w:t>
+      </w:r>
+      <w:proofErr w:type="spellStart"/>
+      <w:r>
+        <w:rPr>
+          <w:sz w:val="17"/>
+        </w:rPr>
+        <w:t>nmap</w:t>
+      </w:r>
+      <w:proofErr w:type="spellEnd"/>
+      <w:r>
+        <w:rPr>
+          <w:sz w:val="17"/>
+        </w:rPr>
+        <w:t xml:space="preserve"> script scan using script: http-methods.</w:t>
       </w:r>
     </w:p>
     <w:p>
@@ -6038,9 +6461,23 @@
       </w:pPr>
       <w:r>
         <w:rPr>
-          <w:sz w:val="24"/>
-        </w:rPr>
-        <w:t>2026-01-29 14:04:47-0500PM ET enumeration Running nmap script scan using script: http-headers.</w:t>
+          <w:sz w:val="17"/>
+        </w:rPr>
+        <w:t xml:space="preserve">2026-01-29 14:04:47-0500PM ET enumeration Running </w:t>
+      </w:r>
+      <w:proofErr w:type="spellStart"/>
+      <w:r>
+        <w:rPr>
+          <w:sz w:val="17"/>
+        </w:rPr>
+        <w:t>nmap</w:t>
+      </w:r>
+      <w:proofErr w:type="spellEnd"/>
+      <w:r>
+        <w:rPr>
+          <w:sz w:val="17"/>
+        </w:rPr>
+        <w:t xml:space="preserve"> script scan using script: http-headers.</w:t>
       </w:r>
     </w:p>
     <w:p>
@@ -6049,9 +6486,23 @@
       </w:pPr>
       <w:r>
         <w:rPr>
-          <w:sz w:val="24"/>
-        </w:rPr>
-        <w:t>2026-01-29 14:04:47-0500PM ET enumeration Running nmap script scan using script: http-robots.txt.</w:t>
+          <w:sz w:val="17"/>
+        </w:rPr>
+        <w:t xml:space="preserve">2026-01-29 14:04:47-0500PM ET enumeration Running </w:t>
+      </w:r>
+      <w:proofErr w:type="spellStart"/>
+      <w:r>
+        <w:rPr>
+          <w:sz w:val="17"/>
+        </w:rPr>
+        <w:t>nmap</w:t>
+      </w:r>
+      <w:proofErr w:type="spellEnd"/>
+      <w:r>
+        <w:rPr>
+          <w:sz w:val="17"/>
+        </w:rPr>
+        <w:t xml:space="preserve"> script scan using script: http-robots.txt.</w:t>
       </w:r>
     </w:p>
     <w:p>
@@ -6060,9 +6511,23 @@
       </w:pPr>
       <w:r>
         <w:rPr>
-          <w:sz w:val="24"/>
-        </w:rPr>
-        <w:t>2026-01-29 14:04:47-0500PM ET enumeration Running nmap script scan using script: http-robots.txt.</w:t>
+          <w:sz w:val="17"/>
+        </w:rPr>
+        <w:t xml:space="preserve">2026-01-29 14:04:47-0500PM ET enumeration Running </w:t>
+      </w:r>
+      <w:proofErr w:type="spellStart"/>
+      <w:r>
+        <w:rPr>
+          <w:sz w:val="17"/>
+        </w:rPr>
+        <w:t>nmap</w:t>
+      </w:r>
+      <w:proofErr w:type="spellEnd"/>
+      <w:r>
+        <w:rPr>
+          <w:sz w:val="17"/>
+        </w:rPr>
+        <w:t xml:space="preserve"> script scan using script: http-robots.txt.</w:t>
       </w:r>
     </w:p>
     <w:p>
@@ -6071,9 +6536,23 @@
       </w:pPr>
       <w:r>
         <w:rPr>
-          <w:sz w:val="24"/>
-        </w:rPr>
-        <w:t>2026-01-29 14:04:47-0500PM ET enumeration Running nmap script scan using script: http-put.</w:t>
+          <w:sz w:val="17"/>
+        </w:rPr>
+        <w:t xml:space="preserve">2026-01-29 14:04:47-0500PM ET enumeration Running </w:t>
+      </w:r>
+      <w:proofErr w:type="spellStart"/>
+      <w:r>
+        <w:rPr>
+          <w:sz w:val="17"/>
+        </w:rPr>
+        <w:t>nmap</w:t>
+      </w:r>
+      <w:proofErr w:type="spellEnd"/>
+      <w:r>
+        <w:rPr>
+          <w:sz w:val="17"/>
+        </w:rPr>
+        <w:t xml:space="preserve"> script scan using script: http-put.</w:t>
       </w:r>
     </w:p>
     <w:p>
@@ -6082,9 +6561,23 @@
       </w:pPr>
       <w:r>
         <w:rPr>
-          <w:sz w:val="24"/>
-        </w:rPr>
-        <w:t>2026-01-29 14:04:47-0500PM ET enumeration Running nmap script scan using script: http-title.</w:t>
+          <w:sz w:val="17"/>
+        </w:rPr>
+        <w:t xml:space="preserve">2026-01-29 14:04:47-0500PM ET enumeration Running </w:t>
+      </w:r>
+      <w:proofErr w:type="spellStart"/>
+      <w:r>
+        <w:rPr>
+          <w:sz w:val="17"/>
+        </w:rPr>
+        <w:t>nmap</w:t>
+      </w:r>
+      <w:proofErr w:type="spellEnd"/>
+      <w:r>
+        <w:rPr>
+          <w:sz w:val="17"/>
+        </w:rPr>
+        <w:t xml:space="preserve"> script scan using script: http-title.</w:t>
       </w:r>
     </w:p>
     <w:p>
@@ -6093,9 +6586,23 @@
       </w:pPr>
       <w:r>
         <w:rPr>
-          <w:sz w:val="24"/>
-        </w:rPr>
-        <w:t>2026-01-29 14:04:47-0500PM ET enumeration Running nmap script scan using script: http-shellshock.</w:t>
+          <w:sz w:val="17"/>
+        </w:rPr>
+        <w:t xml:space="preserve">2026-01-29 14:04:47-0500PM ET enumeration Running </w:t>
+      </w:r>
+      <w:proofErr w:type="spellStart"/>
+      <w:r>
+        <w:rPr>
+          <w:sz w:val="17"/>
+        </w:rPr>
+        <w:t>nmap</w:t>
+      </w:r>
+      <w:proofErr w:type="spellEnd"/>
+      <w:r>
+        <w:rPr>
+          <w:sz w:val="17"/>
+        </w:rPr>
+        <w:t xml:space="preserve"> script scan using script: http-shellshock.</w:t>
       </w:r>
     </w:p>
     <w:p>
@@ -6104,9 +6611,23 @@
       </w:pPr>
       <w:r>
         <w:rPr>
-          <w:sz w:val="24"/>
-        </w:rPr>
-        <w:t>2026-01-29 14:04:47-0500PM ET enumeration Running nmap script scan using script: http-methods.</w:t>
+          <w:sz w:val="17"/>
+        </w:rPr>
+        <w:t xml:space="preserve">2026-01-29 14:04:47-0500PM ET enumeration Running </w:t>
+      </w:r>
+      <w:proofErr w:type="spellStart"/>
+      <w:r>
+        <w:rPr>
+          <w:sz w:val="17"/>
+        </w:rPr>
+        <w:t>nmap</w:t>
+      </w:r>
+      <w:proofErr w:type="spellEnd"/>
+      <w:r>
+        <w:rPr>
+          <w:sz w:val="17"/>
+        </w:rPr>
+        <w:t xml:space="preserve"> script scan using script: http-methods.</w:t>
       </w:r>
     </w:p>
     <w:p>
@@ -6115,9 +6636,23 @@
       </w:pPr>
       <w:r>
         <w:rPr>
-          <w:sz w:val="24"/>
-        </w:rPr>
-        <w:t>2026-01-29 14:04:47-0500PM ET enumeration Running nmap script scan using script: sslv2.</w:t>
+          <w:sz w:val="17"/>
+        </w:rPr>
+        <w:t xml:space="preserve">2026-01-29 14:04:47-0500PM ET enumeration Running </w:t>
+      </w:r>
+      <w:proofErr w:type="spellStart"/>
+      <w:r>
+        <w:rPr>
+          <w:sz w:val="17"/>
+        </w:rPr>
+        <w:t>nmap</w:t>
+      </w:r>
+      <w:proofErr w:type="spellEnd"/>
+      <w:r>
+        <w:rPr>
+          <w:sz w:val="17"/>
+        </w:rPr>
+        <w:t xml:space="preserve"> script scan using script: sslv2.</w:t>
       </w:r>
     </w:p>
     <w:p>
@@ -6126,9 +6661,37 @@
       </w:pPr>
       <w:r>
         <w:rPr>
-          <w:sz w:val="24"/>
-        </w:rPr>
-        <w:t>2026-01-29 14:04:47-0500PM ET enumeration Running nmap script scan using script: ssl-cert.</w:t>
+          <w:sz w:val="17"/>
+        </w:rPr>
+        <w:t xml:space="preserve">2026-01-29 14:04:47-0500PM ET enumeration Running </w:t>
+      </w:r>
+      <w:proofErr w:type="spellStart"/>
+      <w:r>
+        <w:rPr>
+          <w:sz w:val="17"/>
+        </w:rPr>
+        <w:t>nmap</w:t>
+      </w:r>
+      <w:proofErr w:type="spellEnd"/>
+      <w:r>
+        <w:rPr>
+          <w:sz w:val="17"/>
+        </w:rPr>
+        <w:t xml:space="preserve"> script scan using script: </w:t>
+      </w:r>
+      <w:proofErr w:type="spellStart"/>
+      <w:r>
+        <w:rPr>
+          <w:sz w:val="17"/>
+        </w:rPr>
+        <w:t>ssl</w:t>
+      </w:r>
+      <w:proofErr w:type="spellEnd"/>
+      <w:r>
+        <w:rPr>
+          <w:sz w:val="17"/>
+        </w:rPr>
+        <w:t>-cert.</w:t>
       </w:r>
     </w:p>
     <w:p>
@@ -6137,9 +6700,51 @@
       </w:pPr>
       <w:r>
         <w:rPr>
-          <w:sz w:val="24"/>
-        </w:rPr>
-        <w:t>2026-01-29 14:04:47-0500PM ET enumeration Running nmap script scan using script: ssl-enum-ciphers.</w:t>
+          <w:sz w:val="17"/>
+        </w:rPr>
+        <w:t xml:space="preserve">2026-01-29 14:04:47-0500PM ET enumeration Running </w:t>
+      </w:r>
+      <w:proofErr w:type="spellStart"/>
+      <w:r>
+        <w:rPr>
+          <w:sz w:val="17"/>
+        </w:rPr>
+        <w:t>nmap</w:t>
+      </w:r>
+      <w:proofErr w:type="spellEnd"/>
+      <w:r>
+        <w:rPr>
+          <w:sz w:val="17"/>
+        </w:rPr>
+        <w:t xml:space="preserve"> script scan using script: </w:t>
+      </w:r>
+      <w:proofErr w:type="spellStart"/>
+      <w:r>
+        <w:rPr>
+          <w:sz w:val="17"/>
+        </w:rPr>
+        <w:t>ssl</w:t>
+      </w:r>
+      <w:proofErr w:type="spellEnd"/>
+      <w:r>
+        <w:rPr>
+          <w:sz w:val="17"/>
+        </w:rPr>
+        <w:t>-</w:t>
+      </w:r>
+      <w:proofErr w:type="spellStart"/>
+      <w:r>
+        <w:rPr>
+          <w:sz w:val="17"/>
+        </w:rPr>
+        <w:t>enum</w:t>
+      </w:r>
+      <w:proofErr w:type="spellEnd"/>
+      <w:r>
+        <w:rPr>
+          <w:sz w:val="17"/>
+        </w:rPr>
+        <w:t>-ciphers.</w:t>
       </w:r>
     </w:p>
     <w:p>
@@ -6148,9 +6753,23 @@
       </w:pPr>
       <w:r>
         <w:rPr>
-          <w:sz w:val="24"/>
-        </w:rPr>
-        <w:t>2026-01-29 14:04:47-0500PM ET enumeration Running nmap script scan using script: http-shellshock.</w:t>
+          <w:sz w:val="17"/>
+        </w:rPr>
+        <w:t xml:space="preserve">2026-01-29 14:04:47-0500PM ET enumeration Running </w:t>
+      </w:r>
+      <w:proofErr w:type="spellStart"/>
+      <w:r>
+        <w:rPr>
+          <w:sz w:val="17"/>
+        </w:rPr>
+        <w:t>nmap</w:t>
+      </w:r>
+      <w:proofErr w:type="spellEnd"/>
+      <w:r>
+        <w:rPr>
+          <w:sz w:val="17"/>
+        </w:rPr>
+        <w:t xml:space="preserve"> script scan using script: http-shellshock.</w:t>
       </w:r>
     </w:p>
     <w:p>
@@ -6159,9 +6778,37 @@
       </w:pPr>
       <w:r>
         <w:rPr>
-          <w:sz w:val="24"/>
-        </w:rPr>
-        <w:t>2026-01-29 14:04:47-0500PM ET enumeration Running nmap script scan using script: ssl-poodle.</w:t>
+          <w:sz w:val="17"/>
+        </w:rPr>
+        <w:t xml:space="preserve">2026-01-29 14:04:47-0500PM ET enumeration Running </w:t>
+      </w:r>
+      <w:proofErr w:type="spellStart"/>
+      <w:r>
+        <w:rPr>
+          <w:sz w:val="17"/>
+        </w:rPr>
+        <w:t>nmap</w:t>
+      </w:r>
+      <w:proofErr w:type="spellEnd"/>
+      <w:r>
+        <w:rPr>
+          <w:sz w:val="17"/>
+        </w:rPr>
+        <w:t xml:space="preserve"> script scan using script: </w:t>
+      </w:r>
+      <w:proofErr w:type="spellStart"/>
+      <w:r>
+        <w:rPr>
+          <w:sz w:val="17"/>
+        </w:rPr>
+        <w:t>ssl</w:t>
+      </w:r>
+      <w:proofErr w:type="spellEnd"/>
+      <w:r>
+        <w:rPr>
+          <w:sz w:val="17"/>
+        </w:rPr>
+        <w:t>-poodle.</w:t>
       </w:r>
     </w:p>
     <w:p>
@@ -6170,9 +6817,23 @@
       </w:pPr>
       <w:r>
         <w:rPr>
-          <w:sz w:val="24"/>
-        </w:rPr>
-        <w:t>2026-01-29 14:04:47-0500PM ET enumeration Running nmap script scan using script: http-put.</w:t>
+          <w:sz w:val="17"/>
+        </w:rPr>
+        <w:t xml:space="preserve">2026-01-29 14:04:47-0500PM ET enumeration Running </w:t>
+      </w:r>
+      <w:proofErr w:type="spellStart"/>
+      <w:r>
+        <w:rPr>
+          <w:sz w:val="17"/>
+        </w:rPr>
+        <w:t>nmap</w:t>
+      </w:r>
+      <w:proofErr w:type="spellEnd"/>
+      <w:r>
+        <w:rPr>
+          <w:sz w:val="17"/>
+        </w:rPr>
+        <w:t xml:space="preserve"> script scan using script: http-put.</w:t>
       </w:r>
     </w:p>
     <w:p>
@@ -6181,9 +6842,37 @@
       </w:pPr>
       <w:r>
         <w:rPr>
-          <w:sz w:val="24"/>
-        </w:rPr>
-        <w:t>2026-01-29 14:04:47-0500PM ET enumeration Running nmap script scan using script: ssl-heartbleed.</w:t>
+          <w:sz w:val="17"/>
+        </w:rPr>
+        <w:t xml:space="preserve">2026-01-29 14:04:47-0500PM ET enumeration Running </w:t>
+      </w:r>
+      <w:proofErr w:type="spellStart"/>
+      <w:r>
+        <w:rPr>
+          <w:sz w:val="17"/>
+        </w:rPr>
+        <w:t>nmap</w:t>
+      </w:r>
+      <w:proofErr w:type="spellEnd"/>
+      <w:r>
+        <w:rPr>
+          <w:sz w:val="17"/>
+        </w:rPr>
+        <w:t xml:space="preserve"> script scan using script: </w:t>
+      </w:r>
+      <w:proofErr w:type="spellStart"/>
+      <w:r>
+        <w:rPr>
+          <w:sz w:val="17"/>
+        </w:rPr>
+        <w:t>ssl-heartbleed</w:t>
+      </w:r>
+      <w:proofErr w:type="spellEnd"/>
+      <w:r>
+        <w:rPr>
+          <w:sz w:val="17"/>
+        </w:rPr>
+        <w:t>.</w:t>
       </w:r>
     </w:p>
     <w:p>
@@ -6192,9 +6881,23 @@
       </w:pPr>
       <w:r>
         <w:rPr>
-          <w:sz w:val="24"/>
-        </w:rPr>
-        <w:t>2026-01-29 14:04:47-0500PM ET enumeration Running nmap script scan using script: http-title.</w:t>
+          <w:sz w:val="17"/>
+        </w:rPr>
+        <w:t xml:space="preserve">2026-01-29 14:04:47-0500PM ET enumeration Running </w:t>
+      </w:r>
+      <w:proofErr w:type="spellStart"/>
+      <w:r>
+        <w:rPr>
+          <w:sz w:val="17"/>
+        </w:rPr>
+        <w:t>nmap</w:t>
+      </w:r>
+      <w:proofErr w:type="spellEnd"/>
+      <w:r>
+        <w:rPr>
+          <w:sz w:val="17"/>
+        </w:rPr>
+        <w:t xml:space="preserve"> script scan using script: http-title.</w:t>
       </w:r>
     </w:p>
     <w:p>
@@ -6203,9 +6906,37 @@
       </w:pPr>
       <w:r>
         <w:rPr>
-          <w:sz w:val="24"/>
-        </w:rPr>
-        <w:t>2026-01-29 14:04:47-0500PM ET enumeration Running nmap script scan using script: ssl-date.</w:t>
+          <w:sz w:val="17"/>
+        </w:rPr>
+        <w:t xml:space="preserve">2026-01-29 14:04:47-0500PM ET enumeration Running </w:t>
+      </w:r>
+      <w:proofErr w:type="spellStart"/>
+      <w:r>
+        <w:rPr>
+          <w:sz w:val="17"/>
+        </w:rPr>
+        <w:t>nmap</w:t>
+      </w:r>
+      <w:proofErr w:type="spellEnd"/>
+      <w:r>
+        <w:rPr>
+          <w:sz w:val="17"/>
+        </w:rPr>
+        <w:t xml:space="preserve"> script scan using script: </w:t>
+      </w:r>
+      <w:proofErr w:type="spellStart"/>
+      <w:r>
+        <w:rPr>
+          <w:sz w:val="17"/>
+        </w:rPr>
+        <w:t>ssl</w:t>
+      </w:r>
+      <w:proofErr w:type="spellEnd"/>
+      <w:r>
+        <w:rPr>
+          <w:sz w:val="17"/>
+        </w:rPr>
+        <w:t>-date.</w:t>
       </w:r>
     </w:p>
     <w:p>
@@ -6214,9 +6945,23 @@
       </w:pPr>
       <w:r>
         <w:rPr>
-          <w:sz w:val="24"/>
-        </w:rPr>
-        <w:t>2026-01-29 14:04:47-0500PM ET enumeration Queuing up MSF module: auxiliary/scanner/ssh/ssh_version.</w:t>
+          <w:sz w:val="17"/>
+        </w:rPr>
+        <w:t>2026-01-29 14:04:47-0500PM ET enumeration Queuing up MSF module: auxiliary/scanner/ssh/</w:t>
+      </w:r>
+      <w:proofErr w:type="spellStart"/>
+      <w:r>
+        <w:rPr>
+          <w:sz w:val="17"/>
+        </w:rPr>
+        <w:t>ssh_version</w:t>
+      </w:r>
+      <w:proofErr w:type="spellEnd"/>
+      <w:r>
+        <w:rPr>
+          <w:sz w:val="17"/>
+        </w:rPr>
+        <w:t>.</w:t>
       </w:r>
     </w:p>
     <w:p>
@@ -6225,9 +6970,37 @@
       </w:pPr>
       <w:r>
         <w:rPr>
-          <w:sz w:val="24"/>
-        </w:rPr>
-        <w:t>2026-01-29 14:05:50-0500PM ET enumeration Completed MSF module: auxiliary/scanner/ssh/ssh_version.</w:t>
+          <w:sz w:val="17"/>
+        </w:rPr>
+        <w:t xml:space="preserve">2026-01-29 14:05:50-0500PM ET enumeration Completed MSF module: </w:t>
+      </w:r>
+      <w:proofErr w:type="gramStart"/>
+      <w:r>
+        <w:rPr>
+          <w:sz w:val="17"/>
+        </w:rPr>
+        <w:t>auxiliary/scanner</w:t>
+      </w:r>
+      <w:proofErr w:type="gramEnd"/>
+      <w:r>
+        <w:rPr>
+          <w:sz w:val="17"/>
+        </w:rPr>
+        <w:t>/ssh/</w:t>
+      </w:r>
+      <w:proofErr w:type="spellStart"/>
+      <w:r>
+        <w:rPr>
+          <w:sz w:val="17"/>
+        </w:rPr>
+        <w:t>ssh_version</w:t>
+      </w:r>
+      <w:proofErr w:type="spellEnd"/>
+      <w:r>
+        <w:rPr>
+          <w:sz w:val="17"/>
+        </w:rPr>
+        <w:t>.</w:t>
       </w:r>
     </w:p>
     <w:p>
@@ -6236,9 +7009,23 @@
       </w:pPr>
       <w:r>
         <w:rPr>
-          <w:sz w:val="24"/>
-        </w:rPr>
-        <w:t>2026-01-29 14:05:50-0500PM ET enumeration Completed nmap script scan using script: http-methods.</w:t>
+          <w:sz w:val="17"/>
+        </w:rPr>
+        <w:t xml:space="preserve">2026-01-29 14:05:50-0500PM ET enumeration Completed </w:t>
+      </w:r>
+      <w:proofErr w:type="spellStart"/>
+      <w:r>
+        <w:rPr>
+          <w:sz w:val="17"/>
+        </w:rPr>
+        <w:t>nmap</w:t>
+      </w:r>
+      <w:proofErr w:type="spellEnd"/>
+      <w:r>
+        <w:rPr>
+          <w:sz w:val="17"/>
+        </w:rPr>
+        <w:t xml:space="preserve"> script scan using script: http-methods.</w:t>
       </w:r>
     </w:p>
     <w:p>
@@ -6247,9 +7034,51 @@
       </w:pPr>
       <w:r>
         <w:rPr>
-          <w:sz w:val="24"/>
-        </w:rPr>
-        <w:t>2026-01-29 14:05:50-0500PM ET enumeration Completed nmap script scan using script: ssl-enum-ciphers.</w:t>
+          <w:sz w:val="17"/>
+        </w:rPr>
+        <w:t xml:space="preserve">2026-01-29 14:05:50-0500PM ET enumeration Completed </w:t>
+      </w:r>
+      <w:proofErr w:type="spellStart"/>
+      <w:r>
+        <w:rPr>
+          <w:sz w:val="17"/>
+        </w:rPr>
+        <w:t>nmap</w:t>
+      </w:r>
+      <w:proofErr w:type="spellEnd"/>
+      <w:r>
+        <w:rPr>
+          <w:sz w:val="17"/>
+        </w:rPr>
+        <w:t xml:space="preserve"> script scan using script: </w:t>
+      </w:r>
+      <w:proofErr w:type="spellStart"/>
+      <w:r>
+        <w:rPr>
+          <w:sz w:val="17"/>
+        </w:rPr>
+        <w:t>ssl</w:t>
+      </w:r>
+      <w:proofErr w:type="spellEnd"/>
+      <w:r>
+        <w:rPr>
+          <w:sz w:val="17"/>
+        </w:rPr>
+        <w:t>-</w:t>
+      </w:r>
+      <w:proofErr w:type="spellStart"/>
+      <w:r>
+        <w:rPr>
+          <w:sz w:val="17"/>
+        </w:rPr>
+        <w:t>enum</w:t>
+      </w:r>
+      <w:proofErr w:type="spellEnd"/>
+      <w:r>
+        <w:rPr>
+          <w:sz w:val="17"/>
+        </w:rPr>
+        <w:t>-ciphers.</w:t>
       </w:r>
     </w:p>
     <w:p>
@@ -6258,9 +7087,23 @@
       </w:pPr>
       <w:r>
         <w:rPr>
-          <w:sz w:val="24"/>
-        </w:rPr>
-        <w:t>2026-01-29 14:05:50-0500PM ET enumeration Completed nmap script scan using script: http-put.</w:t>
+          <w:sz w:val="17"/>
+        </w:rPr>
+        <w:t xml:space="preserve">2026-01-29 14:05:50-0500PM ET enumeration Completed </w:t>
+      </w:r>
+      <w:proofErr w:type="spellStart"/>
+      <w:r>
+        <w:rPr>
+          <w:sz w:val="17"/>
+        </w:rPr>
+        <w:t>nmap</w:t>
+      </w:r>
+      <w:proofErr w:type="spellEnd"/>
+      <w:r>
+        <w:rPr>
+          <w:sz w:val="17"/>
+        </w:rPr>
+        <w:t xml:space="preserve"> script scan using script: http-put.</w:t>
       </w:r>
     </w:p>
     <w:p>
@@ -6269,9 +7112,23 @@
       </w:pPr>
       <w:r>
         <w:rPr>
-          <w:sz w:val="24"/>
-        </w:rPr>
-        <w:t>2026-01-29 14:05:50-0500PM ET enumeration Completed nmap script scan using script: http-robots.txt.</w:t>
+          <w:sz w:val="17"/>
+        </w:rPr>
+        <w:t xml:space="preserve">2026-01-29 14:05:50-0500PM ET enumeration Completed </w:t>
+      </w:r>
+      <w:proofErr w:type="spellStart"/>
+      <w:r>
+        <w:rPr>
+          <w:sz w:val="17"/>
+        </w:rPr>
+        <w:t>nmap</w:t>
+      </w:r>
+      <w:proofErr w:type="spellEnd"/>
+      <w:r>
+        <w:rPr>
+          <w:sz w:val="17"/>
+        </w:rPr>
+        <w:t xml:space="preserve"> script scan using script: http-robots.txt.</w:t>
       </w:r>
     </w:p>
     <w:p>
@@ -6280,9 +7137,38 @@
       </w:pPr>
       <w:r>
         <w:rPr>
-          <w:sz w:val="24"/>
-        </w:rPr>
-        <w:t>2026-01-29 14:05:50-0500PM ET enumeration Completed nmap script scan using script: ssl-heartbleed.</w:t>
+          <w:sz w:val="17"/>
+        </w:rPr>
+        <w:lastRenderedPageBreak/>
+        <w:t xml:space="preserve">2026-01-29 14:05:50-0500PM ET enumeration Completed </w:t>
+      </w:r>
+      <w:proofErr w:type="spellStart"/>
+      <w:r>
+        <w:rPr>
+          <w:sz w:val="17"/>
+        </w:rPr>
+        <w:t>nmap</w:t>
+      </w:r>
+      <w:proofErr w:type="spellEnd"/>
+      <w:r>
+        <w:rPr>
+          <w:sz w:val="17"/>
+        </w:rPr>
+        <w:t xml:space="preserve"> script scan using script: </w:t>
+      </w:r>
+      <w:proofErr w:type="spellStart"/>
+      <w:r>
+        <w:rPr>
+          <w:sz w:val="17"/>
+        </w:rPr>
+        <w:t>ssl-heartbleed</w:t>
+      </w:r>
+      <w:proofErr w:type="spellEnd"/>
+      <w:r>
+        <w:rPr>
+          <w:sz w:val="17"/>
+        </w:rPr>
+        <w:t>.</w:t>
       </w:r>
     </w:p>
     <w:p>
@@ -6291,9 +7177,23 @@
       </w:pPr>
       <w:r>
         <w:rPr>
-          <w:sz w:val="24"/>
-        </w:rPr>
-        <w:t>2026-01-29 14:05:50-0500PM ET enumeration Completed nmap script scan using script: http-shellshock.</w:t>
+          <w:sz w:val="17"/>
+        </w:rPr>
+        <w:t xml:space="preserve">2026-01-29 14:05:50-0500PM ET enumeration Completed </w:t>
+      </w:r>
+      <w:proofErr w:type="spellStart"/>
+      <w:r>
+        <w:rPr>
+          <w:sz w:val="17"/>
+        </w:rPr>
+        <w:t>nmap</w:t>
+      </w:r>
+      <w:proofErr w:type="spellEnd"/>
+      <w:r>
+        <w:rPr>
+          <w:sz w:val="17"/>
+        </w:rPr>
+        <w:t xml:space="preserve"> script scan using script: http-shellshock.</w:t>
       </w:r>
     </w:p>
     <w:p>
@@ -6302,9 +7202,23 @@
       </w:pPr>
       <w:r>
         <w:rPr>
-          <w:sz w:val="24"/>
-        </w:rPr>
-        <w:t>2026-01-29 14:05:50-0500PM ET enumeration Completed nmap script scan using script: http-robots.txt.</w:t>
+          <w:sz w:val="17"/>
+        </w:rPr>
+        <w:t xml:space="preserve">2026-01-29 14:05:50-0500PM ET enumeration Completed </w:t>
+      </w:r>
+      <w:proofErr w:type="spellStart"/>
+      <w:r>
+        <w:rPr>
+          <w:sz w:val="17"/>
+        </w:rPr>
+        <w:t>nmap</w:t>
+      </w:r>
+      <w:proofErr w:type="spellEnd"/>
+      <w:r>
+        <w:rPr>
+          <w:sz w:val="17"/>
+        </w:rPr>
+        <w:t xml:space="preserve"> script scan using script: http-robots.txt.</w:t>
       </w:r>
     </w:p>
     <w:p>
@@ -6313,9 +7227,23 @@
       </w:pPr>
       <w:r>
         <w:rPr>
-          <w:sz w:val="24"/>
-        </w:rPr>
-        <w:t>2026-01-29 14:05:51-0500PM ET enumeration Completed nmap script scan using script: http-put.</w:t>
+          <w:sz w:val="17"/>
+        </w:rPr>
+        <w:t xml:space="preserve">2026-01-29 14:05:51-0500PM ET enumeration Completed </w:t>
+      </w:r>
+      <w:proofErr w:type="spellStart"/>
+      <w:r>
+        <w:rPr>
+          <w:sz w:val="17"/>
+        </w:rPr>
+        <w:t>nmap</w:t>
+      </w:r>
+      <w:proofErr w:type="spellEnd"/>
+      <w:r>
+        <w:rPr>
+          <w:sz w:val="17"/>
+        </w:rPr>
+        <w:t xml:space="preserve"> script scan using script: http-put.</w:t>
       </w:r>
     </w:p>
     <w:p>
@@ -6324,9 +7252,23 @@
       </w:pPr>
       <w:r>
         <w:rPr>
-          <w:sz w:val="24"/>
-        </w:rPr>
-        <w:t>2026-01-29 14:05:51-0500PM ET enumeration Completed nmap script scan using script: http-headers.</w:t>
+          <w:sz w:val="17"/>
+        </w:rPr>
+        <w:t xml:space="preserve">2026-01-29 14:05:51-0500PM ET enumeration Completed </w:t>
+      </w:r>
+      <w:proofErr w:type="spellStart"/>
+      <w:r>
+        <w:rPr>
+          <w:sz w:val="17"/>
+        </w:rPr>
+        <w:t>nmap</w:t>
+      </w:r>
+      <w:proofErr w:type="spellEnd"/>
+      <w:r>
+        <w:rPr>
+          <w:sz w:val="17"/>
+        </w:rPr>
+        <w:t xml:space="preserve"> script scan using script: http-headers.</w:t>
       </w:r>
     </w:p>
     <w:p>
@@ -6335,9 +7277,23 @@
       </w:pPr>
       <w:r>
         <w:rPr>
-          <w:sz w:val="24"/>
-        </w:rPr>
-        <w:t>2026-01-29 14:05:51-0500PM ET enumeration Completed nmap script scan using script: http-methods.</w:t>
+          <w:sz w:val="17"/>
+        </w:rPr>
+        <w:t xml:space="preserve">2026-01-29 14:05:51-0500PM ET enumeration Completed </w:t>
+      </w:r>
+      <w:proofErr w:type="spellStart"/>
+      <w:r>
+        <w:rPr>
+          <w:sz w:val="17"/>
+        </w:rPr>
+        <w:t>nmap</w:t>
+      </w:r>
+      <w:proofErr w:type="spellEnd"/>
+      <w:r>
+        <w:rPr>
+          <w:sz w:val="17"/>
+        </w:rPr>
+        <w:t xml:space="preserve"> script scan using script: http-methods.</w:t>
       </w:r>
     </w:p>
     <w:p>
@@ -6346,9 +7302,37 @@
       </w:pPr>
       <w:r>
         <w:rPr>
-          <w:sz w:val="24"/>
-        </w:rPr>
-        <w:t>2026-01-29 14:05:51-0500PM ET enumeration Completed nmap script scan using script: ssl-date.</w:t>
+          <w:sz w:val="17"/>
+        </w:rPr>
+        <w:t xml:space="preserve">2026-01-29 14:05:51-0500PM ET enumeration Completed </w:t>
+      </w:r>
+      <w:proofErr w:type="spellStart"/>
+      <w:r>
+        <w:rPr>
+          <w:sz w:val="17"/>
+        </w:rPr>
+        <w:t>nmap</w:t>
+      </w:r>
+      <w:proofErr w:type="spellEnd"/>
+      <w:r>
+        <w:rPr>
+          <w:sz w:val="17"/>
+        </w:rPr>
+        <w:t xml:space="preserve"> script scan using script: </w:t>
+      </w:r>
+      <w:proofErr w:type="spellStart"/>
+      <w:r>
+        <w:rPr>
+          <w:sz w:val="17"/>
+        </w:rPr>
+        <w:t>ssl</w:t>
+      </w:r>
+      <w:proofErr w:type="spellEnd"/>
+      <w:r>
+        <w:rPr>
+          <w:sz w:val="17"/>
+        </w:rPr>
+        <w:t>-date.</w:t>
       </w:r>
     </w:p>
     <w:p>
@@ -6357,9 +7341,23 @@
       </w:pPr>
       <w:r>
         <w:rPr>
-          <w:sz w:val="24"/>
-        </w:rPr>
-        <w:t>2026-01-29 14:05:51-0500PM ET enumeration Completed nmap script scan using script: http-title.</w:t>
+          <w:sz w:val="17"/>
+        </w:rPr>
+        <w:t xml:space="preserve">2026-01-29 14:05:51-0500PM ET enumeration Completed </w:t>
+      </w:r>
+      <w:proofErr w:type="spellStart"/>
+      <w:r>
+        <w:rPr>
+          <w:sz w:val="17"/>
+        </w:rPr>
+        <w:t>nmap</w:t>
+      </w:r>
+      <w:proofErr w:type="spellEnd"/>
+      <w:r>
+        <w:rPr>
+          <w:sz w:val="17"/>
+        </w:rPr>
+        <w:t xml:space="preserve"> script scan using script: http-title.</w:t>
       </w:r>
     </w:p>
     <w:p>
@@ -6368,9 +7366,37 @@
       </w:pPr>
       <w:r>
         <w:rPr>
-          <w:sz w:val="24"/>
-        </w:rPr>
-        <w:t>2026-01-29 14:05:51-0500PM ET enumeration Completed nmap script scan using script: http-shellshock.</w:t>
+          <w:sz w:val="17"/>
+        </w:rPr>
+        <w:t xml:space="preserve">2026-01-29 14:05:51-0500PM ET </w:t>
+      </w:r>
+      <w:proofErr w:type="gramStart"/>
+      <w:r>
+        <w:rPr>
+          <w:sz w:val="17"/>
+        </w:rPr>
+        <w:t>enumeration</w:t>
+      </w:r>
+      <w:proofErr w:type="gramEnd"/>
+      <w:r>
+        <w:rPr>
+          <w:sz w:val="17"/>
+        </w:rPr>
+        <w:t xml:space="preserve"> Completed </w:t>
+      </w:r>
+      <w:proofErr w:type="spellStart"/>
+      <w:r>
+        <w:rPr>
+          <w:sz w:val="17"/>
+        </w:rPr>
+        <w:t>nmap</w:t>
+      </w:r>
+      <w:proofErr w:type="spellEnd"/>
+      <w:r>
+        <w:rPr>
+          <w:sz w:val="17"/>
+        </w:rPr>
+        <w:t xml:space="preserve"> script scan using script: http-shellshock.</w:t>
       </w:r>
     </w:p>
     <w:p>
@@ -6379,9 +7405,23 @@
       </w:pPr>
       <w:r>
         <w:rPr>
-          <w:sz w:val="24"/>
-        </w:rPr>
-        <w:t>2026-01-29 14:05:51-0500PM ET enumeration Completed nmap script scan using script: http-headers.</w:t>
+          <w:sz w:val="17"/>
+        </w:rPr>
+        <w:t xml:space="preserve">2026-01-29 14:05:51-0500PM ET enumeration Completed </w:t>
+      </w:r>
+      <w:proofErr w:type="spellStart"/>
+      <w:r>
+        <w:rPr>
+          <w:sz w:val="17"/>
+        </w:rPr>
+        <w:t>nmap</w:t>
+      </w:r>
+      <w:proofErr w:type="spellEnd"/>
+      <w:r>
+        <w:rPr>
+          <w:sz w:val="17"/>
+        </w:rPr>
+        <w:t xml:space="preserve"> script scan using script: http-headers.</w:t>
       </w:r>
     </w:p>
     <w:p>
@@ -6390,9 +7430,51 @@
       </w:pPr>
       <w:r>
         <w:rPr>
-          <w:sz w:val="24"/>
-        </w:rPr>
-        <w:t>2026-01-29 14:05:51-0500PM ET enumeration Completed nmap script scan using script: ssl-poodle.</w:t>
+          <w:sz w:val="17"/>
+        </w:rPr>
+        <w:t xml:space="preserve">2026-01-29 14:05:51-0500PM ET </w:t>
+      </w:r>
+      <w:proofErr w:type="gramStart"/>
+      <w:r>
+        <w:rPr>
+          <w:sz w:val="17"/>
+        </w:rPr>
+        <w:t>enumeration</w:t>
+      </w:r>
+      <w:proofErr w:type="gramEnd"/>
+      <w:r>
+        <w:rPr>
+          <w:sz w:val="17"/>
+        </w:rPr>
+        <w:t xml:space="preserve"> Completed </w:t>
+      </w:r>
+      <w:proofErr w:type="spellStart"/>
+      <w:r>
+        <w:rPr>
+          <w:sz w:val="17"/>
+        </w:rPr>
+        <w:t>nmap</w:t>
+      </w:r>
+      <w:proofErr w:type="spellEnd"/>
+      <w:r>
+        <w:rPr>
+          <w:sz w:val="17"/>
+        </w:rPr>
+        <w:t xml:space="preserve"> script scan using script: </w:t>
+      </w:r>
+      <w:proofErr w:type="spellStart"/>
+      <w:r>
+        <w:rPr>
+          <w:sz w:val="17"/>
+        </w:rPr>
+        <w:t>ssl</w:t>
+      </w:r>
+      <w:proofErr w:type="spellEnd"/>
+      <w:r>
+        <w:rPr>
+          <w:sz w:val="17"/>
+        </w:rPr>
+        <w:t>-poodle.</w:t>
       </w:r>
     </w:p>
     <w:p>
@@ -6401,9 +7483,37 @@
       </w:pPr>
       <w:r>
         <w:rPr>
-          <w:sz w:val="24"/>
-        </w:rPr>
-        <w:t>2026-01-29 14:05:51-0500PM ET enumeration Completed nmap script scan using script: ssl-cert.</w:t>
+          <w:sz w:val="17"/>
+        </w:rPr>
+        <w:t xml:space="preserve">2026-01-29 14:05:51-0500PM ET enumeration Completed </w:t>
+      </w:r>
+      <w:proofErr w:type="spellStart"/>
+      <w:r>
+        <w:rPr>
+          <w:sz w:val="17"/>
+        </w:rPr>
+        <w:t>nmap</w:t>
+      </w:r>
+      <w:proofErr w:type="spellEnd"/>
+      <w:r>
+        <w:rPr>
+          <w:sz w:val="17"/>
+        </w:rPr>
+        <w:t xml:space="preserve"> script scan using script: </w:t>
+      </w:r>
+      <w:proofErr w:type="spellStart"/>
+      <w:r>
+        <w:rPr>
+          <w:sz w:val="17"/>
+        </w:rPr>
+        <w:t>ssl</w:t>
+      </w:r>
+      <w:proofErr w:type="spellEnd"/>
+      <w:r>
+        <w:rPr>
+          <w:sz w:val="17"/>
+        </w:rPr>
+        <w:t>-cert.</w:t>
       </w:r>
     </w:p>
     <w:p>
@@ -6412,9 +7522,23 @@
       </w:pPr>
       <w:r>
         <w:rPr>
-          <w:sz w:val="24"/>
-        </w:rPr>
-        <w:t>2026-01-29 14:05:51-0500PM ET enumeration Completed nmap script scan using script: sslv2.</w:t>
+          <w:sz w:val="17"/>
+        </w:rPr>
+        <w:t xml:space="preserve">2026-01-29 14:05:51-0500PM ET enumeration Completed </w:t>
+      </w:r>
+      <w:proofErr w:type="spellStart"/>
+      <w:r>
+        <w:rPr>
+          <w:sz w:val="17"/>
+        </w:rPr>
+        <w:t>nmap</w:t>
+      </w:r>
+      <w:proofErr w:type="spellEnd"/>
+      <w:r>
+        <w:rPr>
+          <w:sz w:val="17"/>
+        </w:rPr>
+        <w:t xml:space="preserve"> script scan using script: sslv2.</w:t>
       </w:r>
     </w:p>
     <w:p>
@@ -6423,9 +7547,23 @@
       </w:pPr>
       <w:r>
         <w:rPr>
-          <w:sz w:val="24"/>
-        </w:rPr>
-        <w:t>2026-01-29 14:05:51-0500PM ET enumeration Completed nmap script scan using script: http-title.</w:t>
+          <w:sz w:val="17"/>
+        </w:rPr>
+        <w:t xml:space="preserve">2026-01-29 14:05:51-0500PM ET enumeration Completed </w:t>
+      </w:r>
+      <w:proofErr w:type="spellStart"/>
+      <w:r>
+        <w:rPr>
+          <w:sz w:val="17"/>
+        </w:rPr>
+        <w:t>nmap</w:t>
+      </w:r>
+      <w:proofErr w:type="spellEnd"/>
+      <w:r>
+        <w:rPr>
+          <w:sz w:val="17"/>
+        </w:rPr>
+        <w:t xml:space="preserve"> script scan using script: http-title.</w:t>
       </w:r>
     </w:p>
     <w:p>
@@ -6434,9 +7572,37 @@
       </w:pPr>
       <w:r>
         <w:rPr>
-          <w:sz w:val="24"/>
-        </w:rPr>
-        <w:t>2026-01-29 14:05:51-0500PM ET enumeration Peforming a hidden directory enumeration attack on 80/tcp.</w:t>
+          <w:sz w:val="17"/>
+        </w:rPr>
+        <w:t xml:space="preserve">2026-01-29 14:05:51-0500PM ET enumeration </w:t>
+      </w:r>
+      <w:proofErr w:type="spellStart"/>
+      <w:r>
+        <w:rPr>
+          <w:sz w:val="17"/>
+        </w:rPr>
+        <w:t>Peforming</w:t>
+      </w:r>
+      <w:proofErr w:type="spellEnd"/>
+      <w:r>
+        <w:rPr>
+          <w:sz w:val="17"/>
+        </w:rPr>
+        <w:t xml:space="preserve"> a hidden directory enumeration attack on 80/</w:t>
+      </w:r>
+      <w:proofErr w:type="spellStart"/>
+      <w:r>
+        <w:rPr>
+          <w:sz w:val="17"/>
+        </w:rPr>
+        <w:t>tcp</w:t>
+      </w:r>
+      <w:proofErr w:type="spellEnd"/>
+      <w:r>
+        <w:rPr>
+          <w:sz w:val="17"/>
+        </w:rPr>
+        <w:t>.</w:t>
       </w:r>
     </w:p>
     <w:p>
@@ -6445,9 +7611,23 @@
       </w:pPr>
       <w:r>
         <w:rPr>
-          <w:sz w:val="24"/>
-        </w:rPr>
-        <w:t>2026-01-29 14:05:54-0500PM ET enumeration Running nmap script scan using script: sshv1.</w:t>
+          <w:sz w:val="17"/>
+        </w:rPr>
+        <w:t xml:space="preserve">2026-01-29 14:05:54-0500PM ET enumeration Running </w:t>
+      </w:r>
+      <w:proofErr w:type="spellStart"/>
+      <w:r>
+        <w:rPr>
+          <w:sz w:val="17"/>
+        </w:rPr>
+        <w:t>nmap</w:t>
+      </w:r>
+      <w:proofErr w:type="spellEnd"/>
+      <w:r>
+        <w:rPr>
+          <w:sz w:val="17"/>
+        </w:rPr>
+        <w:t xml:space="preserve"> script scan using script: sshv1.</w:t>
       </w:r>
     </w:p>
     <w:p>
@@ -6456,9 +7636,23 @@
       </w:pPr>
       <w:r>
         <w:rPr>
-          <w:sz w:val="24"/>
-        </w:rPr>
-        <w:t>2026-01-29 14:05:54-0500PM ET enumeration Running nmap script scan using script: ssh2-enum-algos.</w:t>
+          <w:sz w:val="17"/>
+        </w:rPr>
+        <w:t xml:space="preserve">2026-01-29 14:05:54-0500PM ET enumeration Running </w:t>
+      </w:r>
+      <w:proofErr w:type="spellStart"/>
+      <w:r>
+        <w:rPr>
+          <w:sz w:val="17"/>
+        </w:rPr>
+        <w:t>nmap</w:t>
+      </w:r>
+      <w:proofErr w:type="spellEnd"/>
+      <w:r>
+        <w:rPr>
+          <w:sz w:val="17"/>
+        </w:rPr>
+        <w:t xml:space="preserve"> script scan using script: ssh2-enum-algos.</w:t>
       </w:r>
     </w:p>
     <w:p>
@@ -6467,18 +7661,36 @@
       </w:pPr>
       <w:r>
         <w:rPr>
-          <w:sz w:val="24"/>
-        </w:rPr>
-        <w:t>2026-01-29 14:05:54-0500PM ET enumeration Running nmap script scan using script: ssh-auth-methods.</w:t>
+          <w:sz w:val="17"/>
+        </w:rPr>
+        <w:t xml:space="preserve">2026-01-29 14:05:54-0500PM ET enumeration Running </w:t>
+      </w:r>
+      <w:proofErr w:type="spellStart"/>
+      <w:r>
+        <w:rPr>
+          <w:sz w:val="17"/>
+        </w:rPr>
+        <w:t>nmap</w:t>
+      </w:r>
+      <w:proofErr w:type="spellEnd"/>
+      <w:r>
+        <w:rPr>
+          <w:sz w:val="17"/>
+        </w:rPr>
+        <w:t xml:space="preserve"> script scan using script: ssh-auth-methods.</w:t>
       </w:r>
     </w:p>
     <w:p>
       <w:pPr>
         <w:pStyle w:val="ActivityBullet"/>
-      </w:pPr>
-      <w:r>
-        <w:rPr>
-          <w:sz w:val="24"/>
+        <w:rPr>
+          <w:lang w:val="fr-FR"/>
+        </w:rPr>
+      </w:pPr>
+      <w:r>
+        <w:rPr>
+          <w:sz w:val="17"/>
+          <w:lang w:val="fr-FR"/>
         </w:rPr>
         <w:t>2026-01-29 14:05:54-0500PM ET enumeration Analyzing SSL/TLS protocols on port 443/tcp.</w:t>
       </w:r>
@@ -6489,9 +7701,23 @@
       </w:pPr>
       <w:r>
         <w:rPr>
-          <w:sz w:val="24"/>
-        </w:rPr>
-        <w:t>2026-01-29 14:06:55-0500PM ET enumeration Completed SSL/TLS analysis on ports 443/tcp.</w:t>
+          <w:sz w:val="17"/>
+        </w:rPr>
+        <w:t>2026-01-29 14:06:55-0500PM ET enumeration Completed SSL/TLS analysis on ports 443/</w:t>
+      </w:r>
+      <w:proofErr w:type="spellStart"/>
+      <w:r>
+        <w:rPr>
+          <w:sz w:val="17"/>
+        </w:rPr>
+        <w:t>tcp</w:t>
+      </w:r>
+      <w:proofErr w:type="spellEnd"/>
+      <w:r>
+        <w:rPr>
+          <w:sz w:val="17"/>
+        </w:rPr>
+        <w:t>.</w:t>
       </w:r>
     </w:p>
     <w:p>
@@ -6500,7 +7726,7 @@
       </w:pPr>
       <w:r>
         <w:rPr>
-          <w:sz w:val="24"/>
+          <w:sz w:val="17"/>
         </w:rPr>
         <w:t>2026-01-29 14:06:55-0500PM ET enumeration Completed hidden directory enumeration scan.</w:t>
       </w:r>
@@ -6511,9 +7737,37 @@
       </w:pPr>
       <w:r>
         <w:rPr>
-          <w:sz w:val="24"/>
-        </w:rPr>
-        <w:t>2026-01-29 14:06:55-0500PM ET enumeration Peforming a hidden directory enumeration attack on 443/tcp.</w:t>
+          <w:sz w:val="17"/>
+        </w:rPr>
+        <w:t xml:space="preserve">2026-01-29 14:06:55-0500PM ET enumeration </w:t>
+      </w:r>
+      <w:proofErr w:type="spellStart"/>
+      <w:r>
+        <w:rPr>
+          <w:sz w:val="17"/>
+        </w:rPr>
+        <w:t>Peforming</w:t>
+      </w:r>
+      <w:proofErr w:type="spellEnd"/>
+      <w:r>
+        <w:rPr>
+          <w:sz w:val="17"/>
+        </w:rPr>
+        <w:t xml:space="preserve"> a hidden directory enumeration attack on 443/</w:t>
+      </w:r>
+      <w:proofErr w:type="spellStart"/>
+      <w:r>
+        <w:rPr>
+          <w:sz w:val="17"/>
+        </w:rPr>
+        <w:t>tcp</w:t>
+      </w:r>
+      <w:proofErr w:type="spellEnd"/>
+      <w:r>
+        <w:rPr>
+          <w:sz w:val="17"/>
+        </w:rPr>
+        <w:t>.</w:t>
       </w:r>
     </w:p>
     <w:p>
@@ -6522,9 +7776,23 @@
       </w:pPr>
       <w:r>
         <w:rPr>
-          <w:sz w:val="24"/>
-        </w:rPr>
-        <w:t>2026-01-29 14:06:55-0500PM ET enumeration Completed nmap script scan using script: ssh2-enum-algos.</w:t>
+          <w:sz w:val="17"/>
+        </w:rPr>
+        <w:t xml:space="preserve">2026-01-29 14:06:55-0500PM ET enumeration Completed </w:t>
+      </w:r>
+      <w:proofErr w:type="spellStart"/>
+      <w:r>
+        <w:rPr>
+          <w:sz w:val="17"/>
+        </w:rPr>
+        <w:t>nmap</w:t>
+      </w:r>
+      <w:proofErr w:type="spellEnd"/>
+      <w:r>
+        <w:rPr>
+          <w:sz w:val="17"/>
+        </w:rPr>
+        <w:t xml:space="preserve"> script scan using script: ssh2-enum-algos.</w:t>
       </w:r>
     </w:p>
     <w:p>
@@ -6533,9 +7801,23 @@
       </w:pPr>
       <w:r>
         <w:rPr>
-          <w:sz w:val="24"/>
-        </w:rPr>
-        <w:t>2026-01-29 14:06:55-0500PM ET enumeration Completed nmap script scan using script: ssh-auth-methods.</w:t>
+          <w:sz w:val="17"/>
+        </w:rPr>
+        <w:t xml:space="preserve">2026-01-29 14:06:55-0500PM ET enumeration Completed </w:t>
+      </w:r>
+      <w:proofErr w:type="spellStart"/>
+      <w:r>
+        <w:rPr>
+          <w:sz w:val="17"/>
+        </w:rPr>
+        <w:t>nmap</w:t>
+      </w:r>
+      <w:proofErr w:type="spellEnd"/>
+      <w:r>
+        <w:rPr>
+          <w:sz w:val="17"/>
+        </w:rPr>
+        <w:t xml:space="preserve"> script scan using script: ssh-auth-methods.</w:t>
       </w:r>
     </w:p>
     <w:p>
@@ -6544,9 +7826,23 @@
       </w:pPr>
       <w:r>
         <w:rPr>
-          <w:sz w:val="24"/>
-        </w:rPr>
-        <w:t>2026-01-29 14:06:55-0500PM ET enumeration Completed nmap script scan using script: sshv1.</w:t>
+          <w:sz w:val="17"/>
+        </w:rPr>
+        <w:t xml:space="preserve">2026-01-29 14:06:55-0500PM ET enumeration Completed </w:t>
+      </w:r>
+      <w:proofErr w:type="spellStart"/>
+      <w:r>
+        <w:rPr>
+          <w:sz w:val="17"/>
+        </w:rPr>
+        <w:t>nmap</w:t>
+      </w:r>
+      <w:proofErr w:type="spellEnd"/>
+      <w:r>
+        <w:rPr>
+          <w:sz w:val="17"/>
+        </w:rPr>
+        <w:t xml:space="preserve"> script scan using script: sshv1.</w:t>
       </w:r>
     </w:p>
     <w:p>
@@ -6555,9 +7851,37 @@
       </w:pPr>
       <w:r>
         <w:rPr>
-          <w:sz w:val="24"/>
-        </w:rPr>
-        <w:t>2026-01-29 14:06:55-0500PM ET enumeration Completed enumerating SSH services.</w:t>
+          <w:sz w:val="17"/>
+        </w:rPr>
+        <w:t xml:space="preserve">2026-01-29 14:06:55-0500PM ET </w:t>
+      </w:r>
+      <w:proofErr w:type="gramStart"/>
+      <w:r>
+        <w:rPr>
+          <w:sz w:val="17"/>
+        </w:rPr>
+        <w:t>enumeration</w:t>
+      </w:r>
+      <w:proofErr w:type="gramEnd"/>
+      <w:r>
+        <w:rPr>
+          <w:sz w:val="17"/>
+        </w:rPr>
+        <w:t xml:space="preserve"> Completed </w:t>
+      </w:r>
+      <w:proofErr w:type="gramStart"/>
+      <w:r>
+        <w:rPr>
+          <w:sz w:val="17"/>
+        </w:rPr>
+        <w:t>enumerating</w:t>
+      </w:r>
+      <w:proofErr w:type="gramEnd"/>
+      <w:r>
+        <w:rPr>
+          <w:sz w:val="17"/>
+        </w:rPr>
+        <w:t xml:space="preserve"> SSH services.</w:t>
       </w:r>
     </w:p>
     <w:p>
@@ -6566,9 +7890,23 @@
       </w:pPr>
       <w:r>
         <w:rPr>
-          <w:sz w:val="24"/>
-        </w:rPr>
-        <w:t>2026-01-29 14:06:58-0500PM ET enumeration Analyzing web services running on port 80/tcp.</w:t>
+          <w:sz w:val="17"/>
+        </w:rPr>
+        <w:t>2026-01-29 14:06:58-0500PM ET enumeration Analyzing web services running on port 80/</w:t>
+      </w:r>
+      <w:proofErr w:type="spellStart"/>
+      <w:r>
+        <w:rPr>
+          <w:sz w:val="17"/>
+        </w:rPr>
+        <w:t>tcp</w:t>
+      </w:r>
+      <w:proofErr w:type="spellEnd"/>
+      <w:r>
+        <w:rPr>
+          <w:sz w:val="17"/>
+        </w:rPr>
+        <w:t>.</w:t>
       </w:r>
     </w:p>
     <w:p>
@@ -6577,9 +7915,23 @@
       </w:pPr>
       <w:r>
         <w:rPr>
-          <w:sz w:val="24"/>
-        </w:rPr>
-        <w:t>2026-01-29 14:08:10-0500PM ET enumeration Completed analyzing web services running on port 80/tcp.</w:t>
+          <w:sz w:val="17"/>
+        </w:rPr>
+        <w:t>2026-01-29 14:08:10-0500PM ET enumeration Completed analyzing web services running on port 80/</w:t>
+      </w:r>
+      <w:proofErr w:type="spellStart"/>
+      <w:r>
+        <w:rPr>
+          <w:sz w:val="17"/>
+        </w:rPr>
+        <w:t>tcp</w:t>
+      </w:r>
+      <w:proofErr w:type="spellEnd"/>
+      <w:r>
+        <w:rPr>
+          <w:sz w:val="17"/>
+        </w:rPr>
+        <w:t>.</w:t>
       </w:r>
     </w:p>
     <w:p>
@@ -6588,9 +7940,37 @@
       </w:pPr>
       <w:r>
         <w:rPr>
-          <w:sz w:val="24"/>
-        </w:rPr>
-        <w:t>2026-01-29 14:08:10-0500PM ET enumeration Completed hidden directory enumeration scan.</w:t>
+          <w:sz w:val="17"/>
+        </w:rPr>
+        <w:t xml:space="preserve">2026-01-29 14:08:10-0500PM ET </w:t>
+      </w:r>
+      <w:proofErr w:type="gramStart"/>
+      <w:r>
+        <w:rPr>
+          <w:sz w:val="17"/>
+        </w:rPr>
+        <w:t>enumeration</w:t>
+      </w:r>
+      <w:proofErr w:type="gramEnd"/>
+      <w:r>
+        <w:rPr>
+          <w:sz w:val="17"/>
+        </w:rPr>
+        <w:t xml:space="preserve"> Completed </w:t>
+      </w:r>
+      <w:proofErr w:type="gramStart"/>
+      <w:r>
+        <w:rPr>
+          <w:sz w:val="17"/>
+        </w:rPr>
+        <w:t>hidden directory enumeration scan</w:t>
+      </w:r>
+      <w:proofErr w:type="gramEnd"/>
+      <w:r>
+        <w:rPr>
+          <w:sz w:val="17"/>
+        </w:rPr>
+        <w:t>.</w:t>
       </w:r>
     </w:p>
     <w:p>
@@ -6599,9 +7979,23 @@
       </w:pPr>
       <w:r>
         <w:rPr>
-          <w:sz w:val="24"/>
-        </w:rPr>
-        <w:t>2026-01-29 14:08:10-0500PM ET enumeration Completed analyzing web services running on port 80/tcp.</w:t>
+          <w:sz w:val="17"/>
+        </w:rPr>
+        <w:t>2026-01-29 14:08:10-0500PM ET enumeration Completed analyzing web services running on port 80/</w:t>
+      </w:r>
+      <w:proofErr w:type="spellStart"/>
+      <w:r>
+        <w:rPr>
+          <w:sz w:val="17"/>
+        </w:rPr>
+        <w:t>tcp</w:t>
+      </w:r>
+      <w:proofErr w:type="spellEnd"/>
+      <w:r>
+        <w:rPr>
+          <w:sz w:val="17"/>
+        </w:rPr>
+        <w:t>.</w:t>
       </w:r>
     </w:p>
     <w:p>
@@ -6610,9 +8004,37 @@
       </w:pPr>
       <w:r>
         <w:rPr>
-          <w:sz w:val="24"/>
-        </w:rPr>
-        <w:t>2026-01-29 14:08:10-0500PM ET enumeration Completed enumerating HTTP services.</w:t>
+          <w:sz w:val="17"/>
+        </w:rPr>
+        <w:t xml:space="preserve">2026-01-29 14:08:10-0500PM ET </w:t>
+      </w:r>
+      <w:proofErr w:type="gramStart"/>
+      <w:r>
+        <w:rPr>
+          <w:sz w:val="17"/>
+        </w:rPr>
+        <w:t>enumeration</w:t>
+      </w:r>
+      <w:proofErr w:type="gramEnd"/>
+      <w:r>
+        <w:rPr>
+          <w:sz w:val="17"/>
+        </w:rPr>
+        <w:t xml:space="preserve"> Completed </w:t>
+      </w:r>
+      <w:proofErr w:type="gramStart"/>
+      <w:r>
+        <w:rPr>
+          <w:sz w:val="17"/>
+        </w:rPr>
+        <w:t>enumerating</w:t>
+      </w:r>
+      <w:proofErr w:type="gramEnd"/>
+      <w:r>
+        <w:rPr>
+          <w:sz w:val="17"/>
+        </w:rPr>
+        <w:t xml:space="preserve"> HTTP services.</w:t>
       </w:r>
     </w:p>
     <w:p>
@@ -6621,9 +8043,24 @@
       </w:pPr>
       <w:r>
         <w:rPr>
-          <w:sz w:val="24"/>
-        </w:rPr>
-        <w:t>2026-01-29 14:08:13-0500PM ET enumeration Analyzing web services running on port 443/tcp.</w:t>
+          <w:sz w:val="17"/>
+        </w:rPr>
+        <w:lastRenderedPageBreak/>
+        <w:t>2026-01-29 14:08:13-0500PM ET enumeration Analyzing web services running on port 443/</w:t>
+      </w:r>
+      <w:proofErr w:type="spellStart"/>
+      <w:r>
+        <w:rPr>
+          <w:sz w:val="17"/>
+        </w:rPr>
+        <w:t>tcp</w:t>
+      </w:r>
+      <w:proofErr w:type="spellEnd"/>
+      <w:r>
+        <w:rPr>
+          <w:sz w:val="17"/>
+        </w:rPr>
+        <w:t>.</w:t>
       </w:r>
     </w:p>
     <w:p>
@@ -6632,9 +8069,37 @@
       </w:pPr>
       <w:r>
         <w:rPr>
-          <w:sz w:val="24"/>
-        </w:rPr>
-        <w:t>2026-01-29 14:09:15-0500PM ET enumeration Completed analyzing web services running on port 443/tcp.</w:t>
+          <w:sz w:val="17"/>
+        </w:rPr>
+        <w:t xml:space="preserve">2026-01-29 14:09:15-0500PM ET </w:t>
+      </w:r>
+      <w:proofErr w:type="gramStart"/>
+      <w:r>
+        <w:rPr>
+          <w:sz w:val="17"/>
+        </w:rPr>
+        <w:t>enumeration</w:t>
+      </w:r>
+      <w:proofErr w:type="gramEnd"/>
+      <w:r>
+        <w:rPr>
+          <w:sz w:val="17"/>
+        </w:rPr>
+        <w:t xml:space="preserve"> Completed analyzing web services running on port 443/</w:t>
+      </w:r>
+      <w:proofErr w:type="spellStart"/>
+      <w:r>
+        <w:rPr>
+          <w:sz w:val="17"/>
+        </w:rPr>
+        <w:t>tcp</w:t>
+      </w:r>
+      <w:proofErr w:type="spellEnd"/>
+      <w:r>
+        <w:rPr>
+          <w:sz w:val="17"/>
+        </w:rPr>
+        <w:t>.</w:t>
       </w:r>
     </w:p>
     <w:p>
@@ -6643,9 +8108,37 @@
       </w:pPr>
       <w:r>
         <w:rPr>
-          <w:sz w:val="24"/>
-        </w:rPr>
-        <w:t>2026-01-29 14:09:15-0500PM ET enumeration Completed analyzing web services running on port 443/tcp.</w:t>
+          <w:sz w:val="17"/>
+        </w:rPr>
+        <w:t xml:space="preserve">2026-01-29 14:09:15-0500PM ET </w:t>
+      </w:r>
+      <w:proofErr w:type="gramStart"/>
+      <w:r>
+        <w:rPr>
+          <w:sz w:val="17"/>
+        </w:rPr>
+        <w:t>enumeration</w:t>
+      </w:r>
+      <w:proofErr w:type="gramEnd"/>
+      <w:r>
+        <w:rPr>
+          <w:sz w:val="17"/>
+        </w:rPr>
+        <w:t xml:space="preserve"> Completed analyzing web services running on port 443/</w:t>
+      </w:r>
+      <w:proofErr w:type="spellStart"/>
+      <w:r>
+        <w:rPr>
+          <w:sz w:val="17"/>
+        </w:rPr>
+        <w:t>tcp</w:t>
+      </w:r>
+      <w:proofErr w:type="spellEnd"/>
+      <w:r>
+        <w:rPr>
+          <w:sz w:val="17"/>
+        </w:rPr>
+        <w:t>.</w:t>
       </w:r>
     </w:p>
     <w:p>
@@ -6654,7 +8147,7 @@
       </w:pPr>
       <w:r>
         <w:rPr>
-          <w:sz w:val="24"/>
+          <w:sz w:val="17"/>
         </w:rPr>
         <w:t>2026-01-29 14:09:16-0500PM ET enumeration Completed enumerating HTTPS services.</w:t>
       </w:r>
@@ -6665,18 +8158,50 @@
       </w:pPr>
       <w:r>
         <w:rPr>
-          <w:sz w:val="24"/>
-        </w:rPr>
-        <w:t>2026-01-29 14:09:45-0500PM ET enumeration Enumeration module completed.</w:t>
+          <w:sz w:val="17"/>
+        </w:rPr>
+        <w:t xml:space="preserve">2026-01-29 14:09:45-0500PM ET </w:t>
+      </w:r>
+      <w:proofErr w:type="gramStart"/>
+      <w:r>
+        <w:rPr>
+          <w:sz w:val="17"/>
+        </w:rPr>
+        <w:t>enumeration</w:t>
+      </w:r>
+      <w:proofErr w:type="gramEnd"/>
+      <w:r>
+        <w:rPr>
+          <w:sz w:val="17"/>
+        </w:rPr>
+        <w:t xml:space="preserve"> </w:t>
+      </w:r>
+      <w:proofErr w:type="spellStart"/>
+      <w:r>
+        <w:rPr>
+          <w:sz w:val="17"/>
+        </w:rPr>
+        <w:t>Enumeration</w:t>
+      </w:r>
+      <w:proofErr w:type="spellEnd"/>
+      <w:r>
+        <w:rPr>
+          <w:sz w:val="17"/>
+        </w:rPr>
+        <w:t xml:space="preserve"> module completed.</w:t>
       </w:r>
     </w:p>
     <w:p>
       <w:pPr>
         <w:pStyle w:val="ActivityBullet"/>
-      </w:pPr>
-      <w:r>
-        <w:rPr>
-          <w:sz w:val="24"/>
+        <w:rPr>
+          <w:lang w:val="fr-FR"/>
+        </w:rPr>
+      </w:pPr>
+      <w:r>
+        <w:rPr>
+          <w:sz w:val="17"/>
+          <w:lang w:val="fr-FR"/>
         </w:rPr>
         <w:t>2026-01-29 14:10:06-0500PM ET exploit Launching exploit module.</w:t>
       </w:r>
@@ -6687,7 +8212,7 @@
       </w:pPr>
       <w:r>
         <w:rPr>
-          <w:sz w:val="24"/>
+          <w:sz w:val="17"/>
         </w:rPr>
         <w:t>2026-01-29 14:10:11-0500PM ET exploit Queuing up hydra attack: SSH password attack.</w:t>
       </w:r>
@@ -6698,7 +8223,7 @@
       </w:pPr>
       <w:r>
         <w:rPr>
-          <w:sz w:val="24"/>
+          <w:sz w:val="17"/>
         </w:rPr>
         <w:t>2026-01-29 14:11:16-0500PM ET exploit Completed hydra attack: SSH password attack.</w:t>
       </w:r>
@@ -6709,7 +8234,7 @@
       </w:pPr>
       <w:r>
         <w:rPr>
-          <w:sz w:val="24"/>
+          <w:sz w:val="17"/>
         </w:rPr>
         <w:t>2026-01-29 14:11:16-0500PM ET exploit Completed SSH password attack.</w:t>
       </w:r>
@@ -6717,10 +8242,14 @@
     <w:p>
       <w:pPr>
         <w:pStyle w:val="ActivityBullet"/>
-      </w:pPr>
-      <w:r>
-        <w:rPr>
-          <w:sz w:val="24"/>
+        <w:rPr>
+          <w:lang w:val="fr-FR"/>
+        </w:rPr>
+      </w:pPr>
+      <w:r>
+        <w:rPr>
+          <w:sz w:val="17"/>
+          <w:lang w:val="fr-FR"/>
         </w:rPr>
         <w:t>2026-01-29 14:11:49-0500PM ET exploit Completed exploit module.</w:t>
       </w:r>
@@ -6888,7 +8417,7 @@
           <w14:ligatures w14:val="none"/>
         </w:rPr>
         <w:drawing>
-          <wp:inline distT="0" distB="0" distL="0" distR="0" wp14:anchorId="18450119" wp14:editId="2A47D70D">
+          <wp:inline distT="0" distB="0" distL="0" distR="0" wp14:anchorId="1A633A37" wp14:editId="6BBD1CA1">
             <wp:extent cx="152400" cy="152400"/>
             <wp:effectExtent l="0" t="0" r="0" b="0"/>
             <wp:docPr id="89909448" name="Picture 89909448" descr="Fire with solid fill"/>
@@ -6993,7 +8522,7 @@
           <w14:ligatures w14:val="none"/>
         </w:rPr>
         <w:drawing>
-          <wp:inline distT="0" distB="0" distL="0" distR="0" wp14:anchorId="2111E5B1" wp14:editId="54348138">
+          <wp:inline distT="0" distB="0" distL="0" distR="0" wp14:anchorId="510045B9" wp14:editId="001469DD">
             <wp:extent cx="152400" cy="152400"/>
             <wp:effectExtent l="0" t="0" r="0" b="0"/>
             <wp:docPr id="2011428596" name="Picture 2011428596" descr="Fire with solid fill"/>
@@ -7147,7 +8676,7 @@
           <w14:ligatures w14:val="none"/>
         </w:rPr>
         <w:drawing>
-          <wp:inline distT="0" distB="0" distL="0" distR="0" wp14:anchorId="546855AB" wp14:editId="41AB6C58">
+          <wp:inline distT="0" distB="0" distL="0" distR="0" wp14:anchorId="452FB8C2" wp14:editId="52CFB3FB">
             <wp:extent cx="152400" cy="152400"/>
             <wp:effectExtent l="0" t="0" r="0" b="0"/>
             <wp:docPr id="1539496457" name="Picture 4"/>
@@ -7575,7 +9104,7 @@
             <w:color w:val="A6A6A6"/>
             <w:spacing w:val="60"/>
           </w:rPr>
-          <w:pict w14:anchorId="04A3AAEF">
+          <w:pict w14:anchorId="337482DD">
             <v:shapetype id="_x0000_t136" coordsize="21600,21600" o:spt="136" adj="10800" path="m@7,l@8,m@5,21600l@6,21600e">
               <v:formulas>
                 <v:f eqn="sum #0 0 10800"/>

</xml_diff>